<commit_message>
Filter reports to VAF >= 1% and exclude Tier 4
Apply minimum 1% VAF threshold and drop Tier 4 (benign/likely benign)
from annotated CSV output, tiered reports, and clinical docx reports.
Updated annotate_vcf.py, reformat_tiers.py, and ctdna_gui.py worker.
Regenerated all 4 case outputs with new filters.

Before: 538/443/436/410 variants per case (all tiers, all VAFs)
After:  34/33/29/22 variants per case (Tier 1-3 only, VAF >= 1%)

Co-Authored-By: Claude Opus 4.6 <noreply@anthropic.com>
</commit_message>
<xml_diff>
--- a/0224/03-OJS_23953884/03-OJS_23953884_clinical_report.docx
+++ b/0224/03-OJS_23953884/03-OJS_23953884_clinical_report.docx
@@ -4351,1359 +4351,6 @@
           </w:p>
         </w:tc>
       </w:tr>
-      <w:tr>
-        <w:trPr>
-          <w:cnfStyle w:val="000000100000" w:firstRow="0" w:lastRow="0" w:firstColumn="0" w:lastColumn="0" w:oddVBand="0" w:evenVBand="0" w:oddHBand="1" w:evenHBand="0" w:firstRowFirstColumn="0" w:firstRowLastColumn="0" w:lastRowFirstColumn="0" w:lastRowLastColumn="0"/>
-          <w:trHeight w:hRule="exact" w:val="624"/>
-        </w:trPr>
-        <w:tc>
-          <w:tcPr>
-            <w:cnfStyle w:val="001000000000" w:firstRow="0" w:lastRow="0" w:firstColumn="1" w:lastColumn="0" w:oddVBand="0" w:evenVBand="0" w:oddHBand="0" w:evenHBand="0" w:firstRowFirstColumn="0" w:firstRowLastColumn="0" w:lastRowFirstColumn="0" w:lastRowLastColumn="0"/>
-            <w:tcW w:w="1276" w:type="dxa"/>
-            <w:tcBorders>
-              <w:top w:val="double" w:sz="4" w:space="0" w:color="auto"/>
-              <w:bottom w:val="double" w:sz="4" w:space="0" w:color="auto"/>
-            </w:tcBorders>
-            <w:vAlign w:val="center"/>
-          </w:tcPr>
-          <w:p>
-            <w:pPr>
-              <w:spacing w:after="160" w:line="259" w:lineRule="auto"/>
-              <w:jc w:val="center"/>
-              <w:rPr>
-                <w:sz w:val="16"/>
-              </w:rPr>
-            </w:pPr>
-            <w:r>
-              <w:rPr>
-                <w:caps w:val="0"/>
-                <w:sz w:val="16"/>
-              </w:rPr>
-            </w:r>
-            <w:r>
-              <w:rPr>
-                <w:rFonts w:ascii="Malgun Gothic" w:hAnsi="Malgun Gothic"/>
-                <w:b w:val="0"/>
-                <w:sz w:val="18"/>
-              </w:rPr>
-              <w:t>Tier 2</w:t>
-            </w:r>
-          </w:p>
-        </w:tc>
-        <w:tc>
-          <w:tcPr>
-            <w:tcW w:w="851" w:type="dxa"/>
-            <w:tcBorders>
-              <w:top w:val="double" w:sz="4" w:space="0" w:color="auto"/>
-              <w:bottom w:val="double" w:sz="4" w:space="0" w:color="auto"/>
-            </w:tcBorders>
-            <w:vAlign w:val="center"/>
-          </w:tcPr>
-          <w:p>
-            <w:pPr>
-              <w:jc w:val="center"/>
-              <w:cnfStyle w:val="000000100000" w:firstRow="0" w:lastRow="0" w:firstColumn="0" w:lastColumn="0" w:oddVBand="0" w:evenVBand="0" w:oddHBand="1" w:evenHBand="0" w:firstRowFirstColumn="0" w:firstRowLastColumn="0" w:lastRowFirstColumn="0" w:lastRowLastColumn="0"/>
-              <w:rPr>
-                <w:rFonts w:ascii="Arial Narrow" w:hAnsi="Arial Narrow" w:cs="Calibri"/>
-                <w:b/>
-                <w:sz w:val="16"/>
-              </w:rPr>
-            </w:pPr>
-            <w:r>
-              <w:rPr>
-                <w:b/>
-                <w:sz w:val="16"/>
-              </w:rPr>
-            </w:r>
-            <w:r>
-              <w:rPr>
-                <w:rFonts w:ascii="Malgun Gothic" w:hAnsi="Malgun Gothic"/>
-                <w:b w:val="0"/>
-                <w:sz w:val="18"/>
-              </w:rPr>
-              <w:t>KMT2D</w:t>
-            </w:r>
-          </w:p>
-        </w:tc>
-        <w:tc>
-          <w:tcPr>
-            <w:tcW w:w="1134" w:type="dxa"/>
-            <w:tcBorders>
-              <w:top w:val="double" w:sz="4" w:space="0" w:color="auto"/>
-              <w:bottom w:val="double" w:sz="4" w:space="0" w:color="auto"/>
-            </w:tcBorders>
-            <w:vAlign w:val="center"/>
-          </w:tcPr>
-          <w:p>
-            <w:pPr>
-              <w:jc w:val="center"/>
-              <w:cnfStyle w:val="000000100000" w:firstRow="0" w:lastRow="0" w:firstColumn="0" w:lastColumn="0" w:oddVBand="0" w:evenVBand="0" w:oddHBand="1" w:evenHBand="0" w:firstRowFirstColumn="0" w:firstRowLastColumn="0" w:lastRowFirstColumn="0" w:lastRowLastColumn="0"/>
-              <w:rPr>
-                <w:b/>
-                <w:sz w:val="16"/>
-              </w:rPr>
-            </w:pPr>
-            <w:r>
-              <w:rPr>
-                <w:b/>
-                <w:sz w:val="16"/>
-              </w:rPr>
-            </w:r>
-            <w:r>
-              <w:rPr>
-                <w:rFonts w:ascii="Malgun Gothic" w:hAnsi="Malgun Gothic"/>
-                <w:b w:val="0"/>
-                <w:sz w:val="18"/>
-              </w:rPr>
-              <w:t>ENST00000301067.7</w:t>
-            </w:r>
-          </w:p>
-          <w:p>
-            <w:pPr>
-              <w:jc w:val="center"/>
-              <w:cnfStyle w:val="000000100000" w:firstRow="0" w:lastRow="0" w:firstColumn="0" w:lastColumn="0" w:oddVBand="0" w:evenVBand="0" w:oddHBand="1" w:evenHBand="0" w:firstRowFirstColumn="0" w:firstRowLastColumn="0" w:lastRowFirstColumn="0" w:lastRowLastColumn="0"/>
-              <w:rPr>
-                <w:rFonts w:ascii="Arial Narrow" w:hAnsi="Arial Narrow" w:cs="Calibri"/>
-                <w:b/>
-                <w:sz w:val="16"/>
-              </w:rPr>
-            </w:pPr>
-            <w:r>
-              <w:rPr>
-                <w:b/>
-                <w:sz w:val="16"/>
-              </w:rPr>
-            </w:r>
-          </w:p>
-        </w:tc>
-        <w:tc>
-          <w:tcPr>
-            <w:tcW w:w="1417" w:type="dxa"/>
-            <w:tcBorders>
-              <w:top w:val="double" w:sz="4" w:space="0" w:color="auto"/>
-              <w:bottom w:val="double" w:sz="4" w:space="0" w:color="auto"/>
-            </w:tcBorders>
-            <w:vAlign w:val="center"/>
-          </w:tcPr>
-          <w:p>
-            <w:pPr>
-              <w:jc w:val="center"/>
-              <w:cnfStyle w:val="000000100000" w:firstRow="0" w:lastRow="0" w:firstColumn="0" w:lastColumn="0" w:oddVBand="0" w:evenVBand="0" w:oddHBand="1" w:evenHBand="0" w:firstRowFirstColumn="0" w:firstRowLastColumn="0" w:lastRowFirstColumn="0" w:lastRowLastColumn="0"/>
-              <w:rPr>
-                <w:rFonts w:ascii="Arial Narrow" w:hAnsi="Arial Narrow" w:cs="Calibri"/>
-                <w:b/>
-                <w:sz w:val="16"/>
-              </w:rPr>
-            </w:pPr>
-            <w:r>
-              <w:rPr>
-                <w:b/>
-                <w:sz w:val="16"/>
-              </w:rPr>
-            </w:r>
-            <w:r>
-              <w:rPr>
-                <w:rFonts w:ascii="Malgun Gothic" w:hAnsi="Malgun Gothic"/>
-                <w:b w:val="0"/>
-                <w:sz w:val="18"/>
-              </w:rPr>
-              <w:t>ENSP00000301067.7</w:t>
-            </w:r>
-          </w:p>
-        </w:tc>
-        <w:tc>
-          <w:tcPr>
-            <w:tcW w:w="1559" w:type="dxa"/>
-            <w:tcBorders>
-              <w:top w:val="double" w:sz="4" w:space="0" w:color="auto"/>
-              <w:bottom w:val="double" w:sz="4" w:space="0" w:color="auto"/>
-            </w:tcBorders>
-            <w:vAlign w:val="center"/>
-          </w:tcPr>
-          <w:p>
-            <w:pPr>
-              <w:spacing w:after="160" w:line="259" w:lineRule="auto"/>
-              <w:jc w:val="center"/>
-              <w:cnfStyle w:val="000000100000" w:firstRow="0" w:lastRow="0" w:firstColumn="0" w:lastColumn="0" w:oddVBand="0" w:evenVBand="0" w:oddHBand="1" w:evenHBand="0" w:firstRowFirstColumn="0" w:firstRowLastColumn="0" w:lastRowFirstColumn="0" w:lastRowLastColumn="0"/>
-              <w:rPr>
-                <w:b/>
-                <w:sz w:val="16"/>
-              </w:rPr>
-            </w:pPr>
-            <w:r>
-              <w:rPr>
-                <w:b/>
-                <w:sz w:val="16"/>
-              </w:rPr>
-            </w:r>
-            <w:r>
-              <w:rPr>
-                <w:rFonts w:ascii="Malgun Gothic" w:hAnsi="Malgun Gothic"/>
-                <w:b w:val="0"/>
-                <w:sz w:val="18"/>
-              </w:rPr>
-              <w:t>c.2247_2248delinsAT</w:t>
-            </w:r>
-          </w:p>
-        </w:tc>
-        <w:tc>
-          <w:tcPr>
-            <w:tcW w:w="1560" w:type="dxa"/>
-            <w:tcBorders>
-              <w:top w:val="double" w:sz="4" w:space="0" w:color="auto"/>
-              <w:bottom w:val="double" w:sz="4" w:space="0" w:color="auto"/>
-            </w:tcBorders>
-            <w:vAlign w:val="center"/>
-          </w:tcPr>
-          <w:p>
-            <w:pPr>
-              <w:jc w:val="center"/>
-              <w:cnfStyle w:val="000000100000" w:firstRow="0" w:lastRow="0" w:firstColumn="0" w:lastColumn="0" w:oddVBand="0" w:evenVBand="0" w:oddHBand="1" w:evenHBand="0" w:firstRowFirstColumn="0" w:firstRowLastColumn="0" w:lastRowFirstColumn="0" w:lastRowLastColumn="0"/>
-              <w:rPr>
-                <w:rFonts w:ascii="Arial Narrow" w:hAnsi="Arial Narrow" w:cs="Calibri"/>
-                <w:b/>
-                <w:sz w:val="16"/>
-              </w:rPr>
-            </w:pPr>
-            <w:r>
-              <w:rPr>
-                <w:b/>
-                <w:sz w:val="16"/>
-              </w:rPr>
-            </w:r>
-            <w:r>
-              <w:rPr>
-                <w:rFonts w:ascii="Malgun Gothic" w:hAnsi="Malgun Gothic"/>
-                <w:b w:val="0"/>
-                <w:sz w:val="18"/>
-              </w:rPr>
-              <w:t>p.Pro750Ser</w:t>
-            </w:r>
-          </w:p>
-        </w:tc>
-        <w:tc>
-          <w:tcPr>
-            <w:tcW w:w="708" w:type="dxa"/>
-            <w:tcBorders>
-              <w:top w:val="double" w:sz="4" w:space="0" w:color="auto"/>
-              <w:bottom w:val="double" w:sz="4" w:space="0" w:color="auto"/>
-            </w:tcBorders>
-            <w:vAlign w:val="center"/>
-          </w:tcPr>
-          <w:p>
-            <w:pPr>
-              <w:jc w:val="center"/>
-              <w:cnfStyle w:val="000000100000" w:firstRow="0" w:lastRow="0" w:firstColumn="0" w:lastColumn="0" w:oddVBand="0" w:evenVBand="0" w:oddHBand="1" w:evenHBand="0" w:firstRowFirstColumn="0" w:firstRowLastColumn="0" w:lastRowFirstColumn="0" w:lastRowLastColumn="0"/>
-              <w:rPr>
-                <w:rFonts w:ascii="Arial Narrow" w:hAnsi="Arial Narrow" w:cs="Calibri"/>
-                <w:b/>
-                <w:sz w:val="16"/>
-              </w:rPr>
-            </w:pPr>
-            <w:r>
-              <w:rPr>
-                <w:b/>
-                <w:sz w:val="16"/>
-              </w:rPr>
-            </w:r>
-            <w:r>
-              <w:rPr>
-                <w:rFonts w:ascii="Malgun Gothic" w:hAnsi="Malgun Gothic"/>
-                <w:b w:val="0"/>
-                <w:sz w:val="18"/>
-              </w:rPr>
-              <w:t>0.29%</w:t>
-            </w:r>
-          </w:p>
-        </w:tc>
-        <w:tc>
-          <w:tcPr>
-            <w:tcW w:w="1931" w:type="dxa"/>
-            <w:tcBorders>
-              <w:top w:val="double" w:sz="4" w:space="0" w:color="auto"/>
-              <w:bottom w:val="double" w:sz="4" w:space="0" w:color="auto"/>
-            </w:tcBorders>
-            <w:vAlign w:val="center"/>
-          </w:tcPr>
-          <w:p>
-            <w:pPr>
-              <w:jc w:val="center"/>
-              <w:cnfStyle w:val="000000100000" w:firstRow="0" w:lastRow="0" w:firstColumn="0" w:lastColumn="0" w:oddVBand="0" w:evenVBand="0" w:oddHBand="1" w:evenHBand="0" w:firstRowFirstColumn="0" w:firstRowLastColumn="0" w:lastRowFirstColumn="0" w:lastRowLastColumn="0"/>
-              <w:rPr>
-                <w:b/>
-                <w:sz w:val="16"/>
-              </w:rPr>
-            </w:pPr>
-            <w:r>
-              <w:rPr>
-                <w:b/>
-                <w:sz w:val="16"/>
-              </w:rPr>
-            </w:r>
-            <w:proofErr w:type="spellStart"/>
-            <w:r>
-              <w:rPr>
-                <w:b/>
-                <w:sz w:val="16"/>
-              </w:rPr>
-            </w:r>
-            <w:proofErr w:type="spellEnd"/>
-            <w:r>
-              <w:rPr>
-                <w:rFonts w:ascii="Malgun Gothic" w:hAnsi="Malgun Gothic"/>
-                <w:b w:val="0"/>
-                <w:sz w:val="18"/>
-              </w:rPr>
-            </w:r>
-          </w:p>
-          <w:p>
-            <w:pPr>
-              <w:jc w:val="center"/>
-              <w:cnfStyle w:val="000000100000" w:firstRow="0" w:lastRow="0" w:firstColumn="0" w:lastColumn="0" w:oddVBand="0" w:evenVBand="0" w:oddHBand="1" w:evenHBand="0" w:firstRowFirstColumn="0" w:firstRowLastColumn="0" w:lastRowFirstColumn="0" w:lastRowLastColumn="0"/>
-              <w:rPr>
-                <w:rFonts w:ascii="Arial Narrow" w:hAnsi="Arial Narrow" w:cs="Calibri"/>
-                <w:b/>
-                <w:sz w:val="16"/>
-              </w:rPr>
-            </w:pPr>
-            <w:r>
-              <w:rPr>
-                <w:b/>
-                <w:sz w:val="14"/>
-              </w:rPr>
-            </w:r>
-            <w:proofErr w:type="spellStart"/>
-            <w:r>
-              <w:rPr>
-                <w:b/>
-                <w:sz w:val="14"/>
-              </w:rPr>
-            </w:r>
-            <w:proofErr w:type="spellEnd"/>
-            <w:r>
-              <w:rPr>
-                <w:b/>
-                <w:sz w:val="14"/>
-              </w:rPr>
-            </w:r>
-          </w:p>
-        </w:tc>
-      </w:tr>
-      <w:tr>
-        <w:trPr>
-          <w:cnfStyle w:val="000000100000" w:firstRow="0" w:lastRow="0" w:firstColumn="0" w:lastColumn="0" w:oddVBand="0" w:evenVBand="0" w:oddHBand="1" w:evenHBand="0" w:firstRowFirstColumn="0" w:firstRowLastColumn="0" w:lastRowFirstColumn="0" w:lastRowLastColumn="0"/>
-          <w:trHeight w:hRule="exact" w:val="624"/>
-        </w:trPr>
-        <w:tc>
-          <w:tcPr>
-            <w:cnfStyle w:val="001000000000" w:firstRow="0" w:lastRow="0" w:firstColumn="1" w:lastColumn="0" w:oddVBand="0" w:evenVBand="0" w:oddHBand="0" w:evenHBand="0" w:firstRowFirstColumn="0" w:firstRowLastColumn="0" w:lastRowFirstColumn="0" w:lastRowLastColumn="0"/>
-            <w:tcW w:w="1276" w:type="dxa"/>
-            <w:tcBorders>
-              <w:top w:val="double" w:sz="4" w:space="0" w:color="auto"/>
-              <w:bottom w:val="double" w:sz="4" w:space="0" w:color="auto"/>
-            </w:tcBorders>
-            <w:vAlign w:val="center"/>
-          </w:tcPr>
-          <w:p>
-            <w:pPr>
-              <w:spacing w:after="160" w:line="259" w:lineRule="auto"/>
-              <w:jc w:val="center"/>
-              <w:rPr>
-                <w:sz w:val="16"/>
-              </w:rPr>
-            </w:pPr>
-            <w:r>
-              <w:rPr>
-                <w:caps w:val="0"/>
-                <w:sz w:val="16"/>
-              </w:rPr>
-            </w:r>
-            <w:r>
-              <w:rPr>
-                <w:rFonts w:ascii="Malgun Gothic" w:hAnsi="Malgun Gothic"/>
-                <w:b w:val="0"/>
-                <w:sz w:val="18"/>
-              </w:rPr>
-              <w:t>Tier 2</w:t>
-            </w:r>
-          </w:p>
-        </w:tc>
-        <w:tc>
-          <w:tcPr>
-            <w:tcW w:w="851" w:type="dxa"/>
-            <w:tcBorders>
-              <w:top w:val="double" w:sz="4" w:space="0" w:color="auto"/>
-              <w:bottom w:val="double" w:sz="4" w:space="0" w:color="auto"/>
-            </w:tcBorders>
-            <w:vAlign w:val="center"/>
-          </w:tcPr>
-          <w:p>
-            <w:pPr>
-              <w:jc w:val="center"/>
-              <w:cnfStyle w:val="000000100000" w:firstRow="0" w:lastRow="0" w:firstColumn="0" w:lastColumn="0" w:oddVBand="0" w:evenVBand="0" w:oddHBand="1" w:evenHBand="0" w:firstRowFirstColumn="0" w:firstRowLastColumn="0" w:lastRowFirstColumn="0" w:lastRowLastColumn="0"/>
-              <w:rPr>
-                <w:rFonts w:ascii="Arial Narrow" w:hAnsi="Arial Narrow" w:cs="Calibri"/>
-                <w:b/>
-                <w:sz w:val="16"/>
-              </w:rPr>
-            </w:pPr>
-            <w:r>
-              <w:rPr>
-                <w:b/>
-                <w:sz w:val="16"/>
-              </w:rPr>
-            </w:r>
-            <w:r>
-              <w:rPr>
-                <w:rFonts w:ascii="Malgun Gothic" w:hAnsi="Malgun Gothic"/>
-                <w:b w:val="0"/>
-                <w:sz w:val="18"/>
-              </w:rPr>
-              <w:t>MEF2B</w:t>
-            </w:r>
-          </w:p>
-        </w:tc>
-        <w:tc>
-          <w:tcPr>
-            <w:tcW w:w="1134" w:type="dxa"/>
-            <w:tcBorders>
-              <w:top w:val="double" w:sz="4" w:space="0" w:color="auto"/>
-              <w:bottom w:val="double" w:sz="4" w:space="0" w:color="auto"/>
-            </w:tcBorders>
-            <w:vAlign w:val="center"/>
-          </w:tcPr>
-          <w:p>
-            <w:pPr>
-              <w:jc w:val="center"/>
-              <w:cnfStyle w:val="000000100000" w:firstRow="0" w:lastRow="0" w:firstColumn="0" w:lastColumn="0" w:oddVBand="0" w:evenVBand="0" w:oddHBand="1" w:evenHBand="0" w:firstRowFirstColumn="0" w:firstRowLastColumn="0" w:lastRowFirstColumn="0" w:lastRowLastColumn="0"/>
-              <w:rPr>
-                <w:b/>
-                <w:sz w:val="16"/>
-              </w:rPr>
-            </w:pPr>
-            <w:r>
-              <w:rPr>
-                <w:b/>
-                <w:sz w:val="16"/>
-              </w:rPr>
-            </w:r>
-            <w:r>
-              <w:rPr>
-                <w:rFonts w:ascii="Malgun Gothic" w:hAnsi="Malgun Gothic"/>
-                <w:b w:val="0"/>
-                <w:sz w:val="18"/>
-              </w:rPr>
-              <w:t>ENST00000162023.5</w:t>
-            </w:r>
-          </w:p>
-          <w:p>
-            <w:pPr>
-              <w:jc w:val="center"/>
-              <w:cnfStyle w:val="000000100000" w:firstRow="0" w:lastRow="0" w:firstColumn="0" w:lastColumn="0" w:oddVBand="0" w:evenVBand="0" w:oddHBand="1" w:evenHBand="0" w:firstRowFirstColumn="0" w:firstRowLastColumn="0" w:lastRowFirstColumn="0" w:lastRowLastColumn="0"/>
-              <w:rPr>
-                <w:rFonts w:ascii="Arial Narrow" w:hAnsi="Arial Narrow" w:cs="Calibri"/>
-                <w:b/>
-                <w:sz w:val="16"/>
-              </w:rPr>
-            </w:pPr>
-            <w:r>
-              <w:rPr>
-                <w:b/>
-                <w:sz w:val="16"/>
-              </w:rPr>
-            </w:r>
-          </w:p>
-        </w:tc>
-        <w:tc>
-          <w:tcPr>
-            <w:tcW w:w="1417" w:type="dxa"/>
-            <w:tcBorders>
-              <w:top w:val="double" w:sz="4" w:space="0" w:color="auto"/>
-              <w:bottom w:val="double" w:sz="4" w:space="0" w:color="auto"/>
-            </w:tcBorders>
-            <w:vAlign w:val="center"/>
-          </w:tcPr>
-          <w:p>
-            <w:pPr>
-              <w:jc w:val="center"/>
-              <w:cnfStyle w:val="000000100000" w:firstRow="0" w:lastRow="0" w:firstColumn="0" w:lastColumn="0" w:oddVBand="0" w:evenVBand="0" w:oddHBand="1" w:evenHBand="0" w:firstRowFirstColumn="0" w:firstRowLastColumn="0" w:lastRowFirstColumn="0" w:lastRowLastColumn="0"/>
-              <w:rPr>
-                <w:rFonts w:ascii="Arial Narrow" w:hAnsi="Arial Narrow" w:cs="Calibri"/>
-                <w:b/>
-                <w:sz w:val="16"/>
-              </w:rPr>
-            </w:pPr>
-            <w:r>
-              <w:rPr>
-                <w:b/>
-                <w:sz w:val="16"/>
-              </w:rPr>
-            </w:r>
-            <w:r>
-              <w:rPr>
-                <w:rFonts w:ascii="Malgun Gothic" w:hAnsi="Malgun Gothic"/>
-                <w:b w:val="0"/>
-                <w:sz w:val="18"/>
-              </w:rPr>
-              <w:t>ENSP00000162023.5</w:t>
-            </w:r>
-          </w:p>
-        </w:tc>
-        <w:tc>
-          <w:tcPr>
-            <w:tcW w:w="1559" w:type="dxa"/>
-            <w:tcBorders>
-              <w:top w:val="double" w:sz="4" w:space="0" w:color="auto"/>
-              <w:bottom w:val="double" w:sz="4" w:space="0" w:color="auto"/>
-            </w:tcBorders>
-            <w:vAlign w:val="center"/>
-          </w:tcPr>
-          <w:p>
-            <w:pPr>
-              <w:spacing w:after="160" w:line="259" w:lineRule="auto"/>
-              <w:jc w:val="center"/>
-              <w:cnfStyle w:val="000000100000" w:firstRow="0" w:lastRow="0" w:firstColumn="0" w:lastColumn="0" w:oddVBand="0" w:evenVBand="0" w:oddHBand="1" w:evenHBand="0" w:firstRowFirstColumn="0" w:firstRowLastColumn="0" w:lastRowFirstColumn="0" w:lastRowLastColumn="0"/>
-              <w:rPr>
-                <w:b/>
-                <w:sz w:val="16"/>
-              </w:rPr>
-            </w:pPr>
-            <w:r>
-              <w:rPr>
-                <w:b/>
-                <w:sz w:val="16"/>
-              </w:rPr>
-            </w:r>
-            <w:r>
-              <w:rPr>
-                <w:rFonts w:ascii="Malgun Gothic" w:hAnsi="Malgun Gothic"/>
-                <w:b w:val="0"/>
-                <w:sz w:val="18"/>
-              </w:rPr>
-              <w:t>c.9G&gt;T</w:t>
-            </w:r>
-          </w:p>
-        </w:tc>
-        <w:tc>
-          <w:tcPr>
-            <w:tcW w:w="1560" w:type="dxa"/>
-            <w:tcBorders>
-              <w:top w:val="double" w:sz="4" w:space="0" w:color="auto"/>
-              <w:bottom w:val="double" w:sz="4" w:space="0" w:color="auto"/>
-            </w:tcBorders>
-            <w:vAlign w:val="center"/>
-          </w:tcPr>
-          <w:p>
-            <w:pPr>
-              <w:jc w:val="center"/>
-              <w:cnfStyle w:val="000000100000" w:firstRow="0" w:lastRow="0" w:firstColumn="0" w:lastColumn="0" w:oddVBand="0" w:evenVBand="0" w:oddHBand="1" w:evenHBand="0" w:firstRowFirstColumn="0" w:firstRowLastColumn="0" w:lastRowFirstColumn="0" w:lastRowLastColumn="0"/>
-              <w:rPr>
-                <w:rFonts w:ascii="Arial Narrow" w:hAnsi="Arial Narrow" w:cs="Calibri"/>
-                <w:b/>
-                <w:sz w:val="16"/>
-              </w:rPr>
-            </w:pPr>
-            <w:r>
-              <w:rPr>
-                <w:b/>
-                <w:sz w:val="16"/>
-              </w:rPr>
-            </w:r>
-            <w:r>
-              <w:rPr>
-                <w:rFonts w:ascii="Malgun Gothic" w:hAnsi="Malgun Gothic"/>
-                <w:b w:val="0"/>
-                <w:sz w:val="18"/>
-              </w:rPr>
-              <w:t>p.Arg3Ser</w:t>
-            </w:r>
-          </w:p>
-        </w:tc>
-        <w:tc>
-          <w:tcPr>
-            <w:tcW w:w="708" w:type="dxa"/>
-            <w:tcBorders>
-              <w:top w:val="double" w:sz="4" w:space="0" w:color="auto"/>
-              <w:bottom w:val="double" w:sz="4" w:space="0" w:color="auto"/>
-            </w:tcBorders>
-            <w:vAlign w:val="center"/>
-          </w:tcPr>
-          <w:p>
-            <w:pPr>
-              <w:jc w:val="center"/>
-              <w:cnfStyle w:val="000000100000" w:firstRow="0" w:lastRow="0" w:firstColumn="0" w:lastColumn="0" w:oddVBand="0" w:evenVBand="0" w:oddHBand="1" w:evenHBand="0" w:firstRowFirstColumn="0" w:firstRowLastColumn="0" w:lastRowFirstColumn="0" w:lastRowLastColumn="0"/>
-              <w:rPr>
-                <w:rFonts w:ascii="Arial Narrow" w:hAnsi="Arial Narrow" w:cs="Calibri"/>
-                <w:b/>
-                <w:sz w:val="16"/>
-              </w:rPr>
-            </w:pPr>
-            <w:r>
-              <w:rPr>
-                <w:b/>
-                <w:sz w:val="16"/>
-              </w:rPr>
-            </w:r>
-            <w:r>
-              <w:rPr>
-                <w:rFonts w:ascii="Malgun Gothic" w:hAnsi="Malgun Gothic"/>
-                <w:b w:val="0"/>
-                <w:sz w:val="18"/>
-              </w:rPr>
-              <w:t>0.24%</w:t>
-            </w:r>
-          </w:p>
-        </w:tc>
-        <w:tc>
-          <w:tcPr>
-            <w:tcW w:w="1931" w:type="dxa"/>
-            <w:tcBorders>
-              <w:top w:val="double" w:sz="4" w:space="0" w:color="auto"/>
-              <w:bottom w:val="double" w:sz="4" w:space="0" w:color="auto"/>
-            </w:tcBorders>
-            <w:vAlign w:val="center"/>
-          </w:tcPr>
-          <w:p>
-            <w:pPr>
-              <w:jc w:val="center"/>
-              <w:cnfStyle w:val="000000100000" w:firstRow="0" w:lastRow="0" w:firstColumn="0" w:lastColumn="0" w:oddVBand="0" w:evenVBand="0" w:oddHBand="1" w:evenHBand="0" w:firstRowFirstColumn="0" w:firstRowLastColumn="0" w:lastRowFirstColumn="0" w:lastRowLastColumn="0"/>
-              <w:rPr>
-                <w:b/>
-                <w:sz w:val="16"/>
-              </w:rPr>
-            </w:pPr>
-            <w:r>
-              <w:rPr>
-                <w:b/>
-                <w:sz w:val="16"/>
-              </w:rPr>
-            </w:r>
-            <w:proofErr w:type="spellStart"/>
-            <w:r>
-              <w:rPr>
-                <w:b/>
-                <w:sz w:val="16"/>
-              </w:rPr>
-            </w:r>
-            <w:proofErr w:type="spellEnd"/>
-            <w:r>
-              <w:rPr>
-                <w:rFonts w:ascii="Malgun Gothic" w:hAnsi="Malgun Gothic"/>
-                <w:b w:val="0"/>
-                <w:sz w:val="18"/>
-              </w:rPr>
-            </w:r>
-          </w:p>
-          <w:p>
-            <w:pPr>
-              <w:jc w:val="center"/>
-              <w:cnfStyle w:val="000000100000" w:firstRow="0" w:lastRow="0" w:firstColumn="0" w:lastColumn="0" w:oddVBand="0" w:evenVBand="0" w:oddHBand="1" w:evenHBand="0" w:firstRowFirstColumn="0" w:firstRowLastColumn="0" w:lastRowFirstColumn="0" w:lastRowLastColumn="0"/>
-              <w:rPr>
-                <w:rFonts w:ascii="Arial Narrow" w:hAnsi="Arial Narrow" w:cs="Calibri"/>
-                <w:b/>
-                <w:sz w:val="16"/>
-              </w:rPr>
-            </w:pPr>
-            <w:r>
-              <w:rPr>
-                <w:b/>
-                <w:sz w:val="14"/>
-              </w:rPr>
-            </w:r>
-            <w:proofErr w:type="spellStart"/>
-            <w:r>
-              <w:rPr>
-                <w:b/>
-                <w:sz w:val="14"/>
-              </w:rPr>
-            </w:r>
-            <w:proofErr w:type="spellEnd"/>
-            <w:r>
-              <w:rPr>
-                <w:b/>
-                <w:sz w:val="14"/>
-              </w:rPr>
-            </w:r>
-          </w:p>
-        </w:tc>
-      </w:tr>
-      <w:tr>
-        <w:trPr>
-          <w:cnfStyle w:val="000000100000" w:firstRow="0" w:lastRow="0" w:firstColumn="0" w:lastColumn="0" w:oddVBand="0" w:evenVBand="0" w:oddHBand="1" w:evenHBand="0" w:firstRowFirstColumn="0" w:firstRowLastColumn="0" w:lastRowFirstColumn="0" w:lastRowLastColumn="0"/>
-          <w:trHeight w:hRule="exact" w:val="624"/>
-        </w:trPr>
-        <w:tc>
-          <w:tcPr>
-            <w:cnfStyle w:val="001000000000" w:firstRow="0" w:lastRow="0" w:firstColumn="1" w:lastColumn="0" w:oddVBand="0" w:evenVBand="0" w:oddHBand="0" w:evenHBand="0" w:firstRowFirstColumn="0" w:firstRowLastColumn="0" w:lastRowFirstColumn="0" w:lastRowLastColumn="0"/>
-            <w:tcW w:w="1276" w:type="dxa"/>
-            <w:tcBorders>
-              <w:top w:val="double" w:sz="4" w:space="0" w:color="auto"/>
-              <w:bottom w:val="double" w:sz="4" w:space="0" w:color="auto"/>
-            </w:tcBorders>
-            <w:vAlign w:val="center"/>
-          </w:tcPr>
-          <w:p>
-            <w:pPr>
-              <w:spacing w:after="160" w:line="259" w:lineRule="auto"/>
-              <w:jc w:val="center"/>
-              <w:rPr>
-                <w:sz w:val="16"/>
-              </w:rPr>
-            </w:pPr>
-            <w:r>
-              <w:rPr>
-                <w:caps w:val="0"/>
-                <w:sz w:val="16"/>
-              </w:rPr>
-            </w:r>
-            <w:r>
-              <w:rPr>
-                <w:rFonts w:ascii="Malgun Gothic" w:hAnsi="Malgun Gothic"/>
-                <w:b w:val="0"/>
-                <w:sz w:val="18"/>
-              </w:rPr>
-              <w:t>Tier 2</w:t>
-            </w:r>
-          </w:p>
-        </w:tc>
-        <w:tc>
-          <w:tcPr>
-            <w:tcW w:w="851" w:type="dxa"/>
-            <w:tcBorders>
-              <w:top w:val="double" w:sz="4" w:space="0" w:color="auto"/>
-              <w:bottom w:val="double" w:sz="4" w:space="0" w:color="auto"/>
-            </w:tcBorders>
-            <w:vAlign w:val="center"/>
-          </w:tcPr>
-          <w:p>
-            <w:pPr>
-              <w:jc w:val="center"/>
-              <w:cnfStyle w:val="000000100000" w:firstRow="0" w:lastRow="0" w:firstColumn="0" w:lastColumn="0" w:oddVBand="0" w:evenVBand="0" w:oddHBand="1" w:evenHBand="0" w:firstRowFirstColumn="0" w:firstRowLastColumn="0" w:lastRowFirstColumn="0" w:lastRowLastColumn="0"/>
-              <w:rPr>
-                <w:rFonts w:ascii="Arial Narrow" w:hAnsi="Arial Narrow" w:cs="Calibri"/>
-                <w:b/>
-                <w:sz w:val="16"/>
-              </w:rPr>
-            </w:pPr>
-            <w:r>
-              <w:rPr>
-                <w:b/>
-                <w:sz w:val="16"/>
-              </w:rPr>
-            </w:r>
-            <w:r>
-              <w:rPr>
-                <w:rFonts w:ascii="Malgun Gothic" w:hAnsi="Malgun Gothic"/>
-                <w:b w:val="0"/>
-                <w:sz w:val="18"/>
-              </w:rPr>
-              <w:t>BCL2</w:t>
-            </w:r>
-          </w:p>
-        </w:tc>
-        <w:tc>
-          <w:tcPr>
-            <w:tcW w:w="1134" w:type="dxa"/>
-            <w:tcBorders>
-              <w:top w:val="double" w:sz="4" w:space="0" w:color="auto"/>
-              <w:bottom w:val="double" w:sz="4" w:space="0" w:color="auto"/>
-            </w:tcBorders>
-            <w:vAlign w:val="center"/>
-          </w:tcPr>
-          <w:p>
-            <w:pPr>
-              <w:jc w:val="center"/>
-              <w:cnfStyle w:val="000000100000" w:firstRow="0" w:lastRow="0" w:firstColumn="0" w:lastColumn="0" w:oddVBand="0" w:evenVBand="0" w:oddHBand="1" w:evenHBand="0" w:firstRowFirstColumn="0" w:firstRowLastColumn="0" w:lastRowFirstColumn="0" w:lastRowLastColumn="0"/>
-              <w:rPr>
-                <w:b/>
-                <w:sz w:val="16"/>
-              </w:rPr>
-            </w:pPr>
-            <w:r>
-              <w:rPr>
-                <w:b/>
-                <w:sz w:val="16"/>
-              </w:rPr>
-            </w:r>
-            <w:r>
-              <w:rPr>
-                <w:rFonts w:ascii="Malgun Gothic" w:hAnsi="Malgun Gothic"/>
-                <w:b w:val="0"/>
-                <w:sz w:val="18"/>
-              </w:rPr>
-              <w:t>ENST00000398117.1</w:t>
-            </w:r>
-          </w:p>
-          <w:p>
-            <w:pPr>
-              <w:jc w:val="center"/>
-              <w:cnfStyle w:val="000000100000" w:firstRow="0" w:lastRow="0" w:firstColumn="0" w:lastColumn="0" w:oddVBand="0" w:evenVBand="0" w:oddHBand="1" w:evenHBand="0" w:firstRowFirstColumn="0" w:firstRowLastColumn="0" w:lastRowFirstColumn="0" w:lastRowLastColumn="0"/>
-              <w:rPr>
-                <w:rFonts w:ascii="Arial Narrow" w:hAnsi="Arial Narrow" w:cs="Calibri"/>
-                <w:b/>
-                <w:sz w:val="16"/>
-              </w:rPr>
-            </w:pPr>
-            <w:r>
-              <w:rPr>
-                <w:b/>
-                <w:sz w:val="16"/>
-              </w:rPr>
-            </w:r>
-          </w:p>
-        </w:tc>
-        <w:tc>
-          <w:tcPr>
-            <w:tcW w:w="1417" w:type="dxa"/>
-            <w:tcBorders>
-              <w:top w:val="double" w:sz="4" w:space="0" w:color="auto"/>
-              <w:bottom w:val="double" w:sz="4" w:space="0" w:color="auto"/>
-            </w:tcBorders>
-            <w:vAlign w:val="center"/>
-          </w:tcPr>
-          <w:p>
-            <w:pPr>
-              <w:jc w:val="center"/>
-              <w:cnfStyle w:val="000000100000" w:firstRow="0" w:lastRow="0" w:firstColumn="0" w:lastColumn="0" w:oddVBand="0" w:evenVBand="0" w:oddHBand="1" w:evenHBand="0" w:firstRowFirstColumn="0" w:firstRowLastColumn="0" w:lastRowFirstColumn="0" w:lastRowLastColumn="0"/>
-              <w:rPr>
-                <w:rFonts w:ascii="Arial Narrow" w:hAnsi="Arial Narrow" w:cs="Calibri"/>
-                <w:b/>
-                <w:sz w:val="16"/>
-              </w:rPr>
-            </w:pPr>
-            <w:r>
-              <w:rPr>
-                <w:b/>
-                <w:sz w:val="16"/>
-              </w:rPr>
-            </w:r>
-            <w:r>
-              <w:rPr>
-                <w:rFonts w:ascii="Malgun Gothic" w:hAnsi="Malgun Gothic"/>
-                <w:b w:val="0"/>
-                <w:sz w:val="18"/>
-              </w:rPr>
-              <w:t>ENSP00000381185.1</w:t>
-            </w:r>
-          </w:p>
-        </w:tc>
-        <w:tc>
-          <w:tcPr>
-            <w:tcW w:w="1559" w:type="dxa"/>
-            <w:tcBorders>
-              <w:top w:val="double" w:sz="4" w:space="0" w:color="auto"/>
-              <w:bottom w:val="double" w:sz="4" w:space="0" w:color="auto"/>
-            </w:tcBorders>
-            <w:vAlign w:val="center"/>
-          </w:tcPr>
-          <w:p>
-            <w:pPr>
-              <w:spacing w:after="160" w:line="259" w:lineRule="auto"/>
-              <w:jc w:val="center"/>
-              <w:cnfStyle w:val="000000100000" w:firstRow="0" w:lastRow="0" w:firstColumn="0" w:lastColumn="0" w:oddVBand="0" w:evenVBand="0" w:oddHBand="1" w:evenHBand="0" w:firstRowFirstColumn="0" w:firstRowLastColumn="0" w:lastRowFirstColumn="0" w:lastRowLastColumn="0"/>
-              <w:rPr>
-                <w:b/>
-                <w:sz w:val="16"/>
-              </w:rPr>
-            </w:pPr>
-            <w:r>
-              <w:rPr>
-                <w:b/>
-                <w:sz w:val="16"/>
-              </w:rPr>
-            </w:r>
-            <w:r>
-              <w:rPr>
-                <w:rFonts w:ascii="Malgun Gothic" w:hAnsi="Malgun Gothic"/>
-                <w:b w:val="0"/>
-                <w:sz w:val="18"/>
-              </w:rPr>
-              <w:t>c.170C&gt;A</w:t>
-            </w:r>
-          </w:p>
-        </w:tc>
-        <w:tc>
-          <w:tcPr>
-            <w:tcW w:w="1560" w:type="dxa"/>
-            <w:tcBorders>
-              <w:top w:val="double" w:sz="4" w:space="0" w:color="auto"/>
-              <w:bottom w:val="double" w:sz="4" w:space="0" w:color="auto"/>
-            </w:tcBorders>
-            <w:vAlign w:val="center"/>
-          </w:tcPr>
-          <w:p>
-            <w:pPr>
-              <w:jc w:val="center"/>
-              <w:cnfStyle w:val="000000100000" w:firstRow="0" w:lastRow="0" w:firstColumn="0" w:lastColumn="0" w:oddVBand="0" w:evenVBand="0" w:oddHBand="1" w:evenHBand="0" w:firstRowFirstColumn="0" w:firstRowLastColumn="0" w:lastRowFirstColumn="0" w:lastRowLastColumn="0"/>
-              <w:rPr>
-                <w:rFonts w:ascii="Arial Narrow" w:hAnsi="Arial Narrow" w:cs="Calibri"/>
-                <w:b/>
-                <w:sz w:val="16"/>
-              </w:rPr>
-            </w:pPr>
-            <w:r>
-              <w:rPr>
-                <w:b/>
-                <w:sz w:val="16"/>
-              </w:rPr>
-            </w:r>
-            <w:r>
-              <w:rPr>
-                <w:rFonts w:ascii="Malgun Gothic" w:hAnsi="Malgun Gothic"/>
-                <w:b w:val="0"/>
-                <w:sz w:val="18"/>
-              </w:rPr>
-              <w:t>p.Pro57His</w:t>
-            </w:r>
-          </w:p>
-        </w:tc>
-        <w:tc>
-          <w:tcPr>
-            <w:tcW w:w="708" w:type="dxa"/>
-            <w:tcBorders>
-              <w:top w:val="double" w:sz="4" w:space="0" w:color="auto"/>
-              <w:bottom w:val="double" w:sz="4" w:space="0" w:color="auto"/>
-            </w:tcBorders>
-            <w:vAlign w:val="center"/>
-          </w:tcPr>
-          <w:p>
-            <w:pPr>
-              <w:jc w:val="center"/>
-              <w:cnfStyle w:val="000000100000" w:firstRow="0" w:lastRow="0" w:firstColumn="0" w:lastColumn="0" w:oddVBand="0" w:evenVBand="0" w:oddHBand="1" w:evenHBand="0" w:firstRowFirstColumn="0" w:firstRowLastColumn="0" w:lastRowFirstColumn="0" w:lastRowLastColumn="0"/>
-              <w:rPr>
-                <w:rFonts w:ascii="Arial Narrow" w:hAnsi="Arial Narrow" w:cs="Calibri"/>
-                <w:b/>
-                <w:sz w:val="16"/>
-              </w:rPr>
-            </w:pPr>
-            <w:r>
-              <w:rPr>
-                <w:b/>
-                <w:sz w:val="16"/>
-              </w:rPr>
-            </w:r>
-            <w:r>
-              <w:rPr>
-                <w:rFonts w:ascii="Malgun Gothic" w:hAnsi="Malgun Gothic"/>
-                <w:b w:val="0"/>
-                <w:sz w:val="18"/>
-              </w:rPr>
-              <w:t>0.22%</w:t>
-            </w:r>
-          </w:p>
-        </w:tc>
-        <w:tc>
-          <w:tcPr>
-            <w:tcW w:w="1931" w:type="dxa"/>
-            <w:tcBorders>
-              <w:top w:val="double" w:sz="4" w:space="0" w:color="auto"/>
-              <w:bottom w:val="double" w:sz="4" w:space="0" w:color="auto"/>
-            </w:tcBorders>
-            <w:vAlign w:val="center"/>
-          </w:tcPr>
-          <w:p>
-            <w:pPr>
-              <w:jc w:val="center"/>
-              <w:cnfStyle w:val="000000100000" w:firstRow="0" w:lastRow="0" w:firstColumn="0" w:lastColumn="0" w:oddVBand="0" w:evenVBand="0" w:oddHBand="1" w:evenHBand="0" w:firstRowFirstColumn="0" w:firstRowLastColumn="0" w:lastRowFirstColumn="0" w:lastRowLastColumn="0"/>
-              <w:rPr>
-                <w:b/>
-                <w:sz w:val="16"/>
-              </w:rPr>
-            </w:pPr>
-            <w:r>
-              <w:rPr>
-                <w:b/>
-                <w:sz w:val="16"/>
-              </w:rPr>
-            </w:r>
-            <w:proofErr w:type="spellStart"/>
-            <w:r>
-              <w:rPr>
-                <w:b/>
-                <w:sz w:val="16"/>
-              </w:rPr>
-            </w:r>
-            <w:proofErr w:type="spellEnd"/>
-            <w:r>
-              <w:rPr>
-                <w:rFonts w:ascii="Malgun Gothic" w:hAnsi="Malgun Gothic"/>
-                <w:b w:val="0"/>
-                <w:sz w:val="18"/>
-              </w:rPr>
-              <w:t>Venetoclax</w:t>
-            </w:r>
-          </w:p>
-          <w:p>
-            <w:pPr>
-              <w:jc w:val="center"/>
-              <w:cnfStyle w:val="000000100000" w:firstRow="0" w:lastRow="0" w:firstColumn="0" w:lastColumn="0" w:oddVBand="0" w:evenVBand="0" w:oddHBand="1" w:evenHBand="0" w:firstRowFirstColumn="0" w:firstRowLastColumn="0" w:lastRowFirstColumn="0" w:lastRowLastColumn="0"/>
-              <w:rPr>
-                <w:rFonts w:ascii="Arial Narrow" w:hAnsi="Arial Narrow" w:cs="Calibri"/>
-                <w:b/>
-                <w:sz w:val="16"/>
-              </w:rPr>
-            </w:pPr>
-            <w:r>
-              <w:rPr>
-                <w:b/>
-                <w:sz w:val="14"/>
-              </w:rPr>
-            </w:r>
-            <w:proofErr w:type="spellStart"/>
-            <w:r>
-              <w:rPr>
-                <w:b/>
-                <w:sz w:val="14"/>
-              </w:rPr>
-            </w:r>
-            <w:proofErr w:type="spellEnd"/>
-            <w:r>
-              <w:rPr>
-                <w:b/>
-                <w:sz w:val="14"/>
-              </w:rPr>
-            </w:r>
-          </w:p>
-        </w:tc>
-      </w:tr>
-      <w:tr>
-        <w:trPr>
-          <w:cnfStyle w:val="000000100000" w:firstRow="0" w:lastRow="0" w:firstColumn="0" w:lastColumn="0" w:oddVBand="0" w:evenVBand="0" w:oddHBand="1" w:evenHBand="0" w:firstRowFirstColumn="0" w:firstRowLastColumn="0" w:lastRowFirstColumn="0" w:lastRowLastColumn="0"/>
-          <w:trHeight w:hRule="exact" w:val="624"/>
-        </w:trPr>
-        <w:tc>
-          <w:tcPr>
-            <w:cnfStyle w:val="001000000000" w:firstRow="0" w:lastRow="0" w:firstColumn="1" w:lastColumn="0" w:oddVBand="0" w:evenVBand="0" w:oddHBand="0" w:evenHBand="0" w:firstRowFirstColumn="0" w:firstRowLastColumn="0" w:lastRowFirstColumn="0" w:lastRowLastColumn="0"/>
-            <w:tcW w:w="1276" w:type="dxa"/>
-            <w:tcBorders>
-              <w:top w:val="double" w:sz="4" w:space="0" w:color="auto"/>
-              <w:bottom w:val="double" w:sz="4" w:space="0" w:color="auto"/>
-            </w:tcBorders>
-            <w:vAlign w:val="center"/>
-          </w:tcPr>
-          <w:p>
-            <w:pPr>
-              <w:spacing w:after="160" w:line="259" w:lineRule="auto"/>
-              <w:jc w:val="center"/>
-              <w:rPr>
-                <w:sz w:val="16"/>
-              </w:rPr>
-            </w:pPr>
-            <w:r>
-              <w:rPr>
-                <w:caps w:val="0"/>
-                <w:sz w:val="16"/>
-              </w:rPr>
-            </w:r>
-            <w:r>
-              <w:rPr>
-                <w:rFonts w:ascii="Malgun Gothic" w:hAnsi="Malgun Gothic"/>
-                <w:b w:val="0"/>
-                <w:sz w:val="18"/>
-              </w:rPr>
-              <w:t>Tier 2</w:t>
-            </w:r>
-          </w:p>
-        </w:tc>
-        <w:tc>
-          <w:tcPr>
-            <w:tcW w:w="851" w:type="dxa"/>
-            <w:tcBorders>
-              <w:top w:val="double" w:sz="4" w:space="0" w:color="auto"/>
-              <w:bottom w:val="double" w:sz="4" w:space="0" w:color="auto"/>
-            </w:tcBorders>
-            <w:vAlign w:val="center"/>
-          </w:tcPr>
-          <w:p>
-            <w:pPr>
-              <w:jc w:val="center"/>
-              <w:cnfStyle w:val="000000100000" w:firstRow="0" w:lastRow="0" w:firstColumn="0" w:lastColumn="0" w:oddVBand="0" w:evenVBand="0" w:oddHBand="1" w:evenHBand="0" w:firstRowFirstColumn="0" w:firstRowLastColumn="0" w:lastRowFirstColumn="0" w:lastRowLastColumn="0"/>
-              <w:rPr>
-                <w:rFonts w:ascii="Arial Narrow" w:hAnsi="Arial Narrow" w:cs="Calibri"/>
-                <w:b/>
-                <w:sz w:val="16"/>
-              </w:rPr>
-            </w:pPr>
-            <w:r>
-              <w:rPr>
-                <w:b/>
-                <w:sz w:val="16"/>
-              </w:rPr>
-            </w:r>
-            <w:r>
-              <w:rPr>
-                <w:rFonts w:ascii="Malgun Gothic" w:hAnsi="Malgun Gothic"/>
-                <w:b w:val="0"/>
-                <w:sz w:val="18"/>
-              </w:rPr>
-              <w:t>EP300</w:t>
-            </w:r>
-          </w:p>
-        </w:tc>
-        <w:tc>
-          <w:tcPr>
-            <w:tcW w:w="1134" w:type="dxa"/>
-            <w:tcBorders>
-              <w:top w:val="double" w:sz="4" w:space="0" w:color="auto"/>
-              <w:bottom w:val="double" w:sz="4" w:space="0" w:color="auto"/>
-            </w:tcBorders>
-            <w:vAlign w:val="center"/>
-          </w:tcPr>
-          <w:p>
-            <w:pPr>
-              <w:jc w:val="center"/>
-              <w:cnfStyle w:val="000000100000" w:firstRow="0" w:lastRow="0" w:firstColumn="0" w:lastColumn="0" w:oddVBand="0" w:evenVBand="0" w:oddHBand="1" w:evenHBand="0" w:firstRowFirstColumn="0" w:firstRowLastColumn="0" w:lastRowFirstColumn="0" w:lastRowLastColumn="0"/>
-              <w:rPr>
-                <w:b/>
-                <w:sz w:val="16"/>
-              </w:rPr>
-            </w:pPr>
-            <w:r>
-              <w:rPr>
-                <w:b/>
-                <w:sz w:val="16"/>
-              </w:rPr>
-            </w:r>
-            <w:r>
-              <w:rPr>
-                <w:rFonts w:ascii="Malgun Gothic" w:hAnsi="Malgun Gothic"/>
-                <w:b w:val="0"/>
-                <w:sz w:val="18"/>
-              </w:rPr>
-              <w:t>ENST00000263253.7</w:t>
-            </w:r>
-          </w:p>
-          <w:p>
-            <w:pPr>
-              <w:jc w:val="center"/>
-              <w:cnfStyle w:val="000000100000" w:firstRow="0" w:lastRow="0" w:firstColumn="0" w:lastColumn="0" w:oddVBand="0" w:evenVBand="0" w:oddHBand="1" w:evenHBand="0" w:firstRowFirstColumn="0" w:firstRowLastColumn="0" w:lastRowFirstColumn="0" w:lastRowLastColumn="0"/>
-              <w:rPr>
-                <w:rFonts w:ascii="Arial Narrow" w:hAnsi="Arial Narrow" w:cs="Calibri"/>
-                <w:b/>
-                <w:sz w:val="16"/>
-              </w:rPr>
-            </w:pPr>
-            <w:r>
-              <w:rPr>
-                <w:b/>
-                <w:sz w:val="16"/>
-              </w:rPr>
-            </w:r>
-          </w:p>
-        </w:tc>
-        <w:tc>
-          <w:tcPr>
-            <w:tcW w:w="1417" w:type="dxa"/>
-            <w:tcBorders>
-              <w:top w:val="double" w:sz="4" w:space="0" w:color="auto"/>
-              <w:bottom w:val="double" w:sz="4" w:space="0" w:color="auto"/>
-            </w:tcBorders>
-            <w:vAlign w:val="center"/>
-          </w:tcPr>
-          <w:p>
-            <w:pPr>
-              <w:jc w:val="center"/>
-              <w:cnfStyle w:val="000000100000" w:firstRow="0" w:lastRow="0" w:firstColumn="0" w:lastColumn="0" w:oddVBand="0" w:evenVBand="0" w:oddHBand="1" w:evenHBand="0" w:firstRowFirstColumn="0" w:firstRowLastColumn="0" w:lastRowFirstColumn="0" w:lastRowLastColumn="0"/>
-              <w:rPr>
-                <w:rFonts w:ascii="Arial Narrow" w:hAnsi="Arial Narrow" w:cs="Calibri"/>
-                <w:b/>
-                <w:sz w:val="16"/>
-              </w:rPr>
-            </w:pPr>
-            <w:r>
-              <w:rPr>
-                <w:b/>
-                <w:sz w:val="16"/>
-              </w:rPr>
-            </w:r>
-            <w:r>
-              <w:rPr>
-                <w:rFonts w:ascii="Malgun Gothic" w:hAnsi="Malgun Gothic"/>
-                <w:b w:val="0"/>
-                <w:sz w:val="18"/>
-              </w:rPr>
-              <w:t>ENSP00000263253.7</w:t>
-            </w:r>
-          </w:p>
-        </w:tc>
-        <w:tc>
-          <w:tcPr>
-            <w:tcW w:w="1559" w:type="dxa"/>
-            <w:tcBorders>
-              <w:top w:val="double" w:sz="4" w:space="0" w:color="auto"/>
-              <w:bottom w:val="double" w:sz="4" w:space="0" w:color="auto"/>
-            </w:tcBorders>
-            <w:vAlign w:val="center"/>
-          </w:tcPr>
-          <w:p>
-            <w:pPr>
-              <w:spacing w:after="160" w:line="259" w:lineRule="auto"/>
-              <w:jc w:val="center"/>
-              <w:cnfStyle w:val="000000100000" w:firstRow="0" w:lastRow="0" w:firstColumn="0" w:lastColumn="0" w:oddVBand="0" w:evenVBand="0" w:oddHBand="1" w:evenHBand="0" w:firstRowFirstColumn="0" w:firstRowLastColumn="0" w:lastRowFirstColumn="0" w:lastRowLastColumn="0"/>
-              <w:rPr>
-                <w:b/>
-                <w:sz w:val="16"/>
-              </w:rPr>
-            </w:pPr>
-            <w:r>
-              <w:rPr>
-                <w:b/>
-                <w:sz w:val="16"/>
-              </w:rPr>
-            </w:r>
-            <w:r>
-              <w:rPr>
-                <w:rFonts w:ascii="Malgun Gothic" w:hAnsi="Malgun Gothic"/>
-                <w:b w:val="0"/>
-                <w:sz w:val="18"/>
-              </w:rPr>
-              <w:t>c.5954G&gt;A</w:t>
-            </w:r>
-          </w:p>
-        </w:tc>
-        <w:tc>
-          <w:tcPr>
-            <w:tcW w:w="1560" w:type="dxa"/>
-            <w:tcBorders>
-              <w:top w:val="double" w:sz="4" w:space="0" w:color="auto"/>
-              <w:bottom w:val="double" w:sz="4" w:space="0" w:color="auto"/>
-            </w:tcBorders>
-            <w:vAlign w:val="center"/>
-          </w:tcPr>
-          <w:p>
-            <w:pPr>
-              <w:jc w:val="center"/>
-              <w:cnfStyle w:val="000000100000" w:firstRow="0" w:lastRow="0" w:firstColumn="0" w:lastColumn="0" w:oddVBand="0" w:evenVBand="0" w:oddHBand="1" w:evenHBand="0" w:firstRowFirstColumn="0" w:firstRowLastColumn="0" w:lastRowFirstColumn="0" w:lastRowLastColumn="0"/>
-              <w:rPr>
-                <w:rFonts w:ascii="Arial Narrow" w:hAnsi="Arial Narrow" w:cs="Calibri"/>
-                <w:b/>
-                <w:sz w:val="16"/>
-              </w:rPr>
-            </w:pPr>
-            <w:r>
-              <w:rPr>
-                <w:b/>
-                <w:sz w:val="16"/>
-              </w:rPr>
-            </w:r>
-            <w:r>
-              <w:rPr>
-                <w:rFonts w:ascii="Malgun Gothic" w:hAnsi="Malgun Gothic"/>
-                <w:b w:val="0"/>
-                <w:sz w:val="18"/>
-              </w:rPr>
-              <w:t>p.Gly1985Glu</w:t>
-            </w:r>
-          </w:p>
-        </w:tc>
-        <w:tc>
-          <w:tcPr>
-            <w:tcW w:w="708" w:type="dxa"/>
-            <w:tcBorders>
-              <w:top w:val="double" w:sz="4" w:space="0" w:color="auto"/>
-              <w:bottom w:val="double" w:sz="4" w:space="0" w:color="auto"/>
-            </w:tcBorders>
-            <w:vAlign w:val="center"/>
-          </w:tcPr>
-          <w:p>
-            <w:pPr>
-              <w:jc w:val="center"/>
-              <w:cnfStyle w:val="000000100000" w:firstRow="0" w:lastRow="0" w:firstColumn="0" w:lastColumn="0" w:oddVBand="0" w:evenVBand="0" w:oddHBand="1" w:evenHBand="0" w:firstRowFirstColumn="0" w:firstRowLastColumn="0" w:lastRowFirstColumn="0" w:lastRowLastColumn="0"/>
-              <w:rPr>
-                <w:rFonts w:ascii="Arial Narrow" w:hAnsi="Arial Narrow" w:cs="Calibri"/>
-                <w:b/>
-                <w:sz w:val="16"/>
-              </w:rPr>
-            </w:pPr>
-            <w:r>
-              <w:rPr>
-                <w:b/>
-                <w:sz w:val="16"/>
-              </w:rPr>
-            </w:r>
-            <w:r>
-              <w:rPr>
-                <w:rFonts w:ascii="Malgun Gothic" w:hAnsi="Malgun Gothic"/>
-                <w:b w:val="0"/>
-                <w:sz w:val="18"/>
-              </w:rPr>
-              <w:t>0.12%</w:t>
-            </w:r>
-          </w:p>
-        </w:tc>
-        <w:tc>
-          <w:tcPr>
-            <w:tcW w:w="1931" w:type="dxa"/>
-            <w:tcBorders>
-              <w:top w:val="double" w:sz="4" w:space="0" w:color="auto"/>
-              <w:bottom w:val="double" w:sz="4" w:space="0" w:color="auto"/>
-            </w:tcBorders>
-            <w:vAlign w:val="center"/>
-          </w:tcPr>
-          <w:p>
-            <w:pPr>
-              <w:jc w:val="center"/>
-              <w:cnfStyle w:val="000000100000" w:firstRow="0" w:lastRow="0" w:firstColumn="0" w:lastColumn="0" w:oddVBand="0" w:evenVBand="0" w:oddHBand="1" w:evenHBand="0" w:firstRowFirstColumn="0" w:firstRowLastColumn="0" w:lastRowFirstColumn="0" w:lastRowLastColumn="0"/>
-              <w:rPr>
-                <w:b/>
-                <w:sz w:val="16"/>
-              </w:rPr>
-            </w:pPr>
-            <w:r>
-              <w:rPr>
-                <w:b/>
-                <w:sz w:val="16"/>
-              </w:rPr>
-            </w:r>
-            <w:proofErr w:type="spellStart"/>
-            <w:r>
-              <w:rPr>
-                <w:b/>
-                <w:sz w:val="16"/>
-              </w:rPr>
-            </w:r>
-            <w:proofErr w:type="spellEnd"/>
-            <w:r>
-              <w:rPr>
-                <w:rFonts w:ascii="Malgun Gothic" w:hAnsi="Malgun Gothic"/>
-                <w:b w:val="0"/>
-                <w:sz w:val="18"/>
-              </w:rPr>
-            </w:r>
-          </w:p>
-          <w:p>
-            <w:pPr>
-              <w:jc w:val="center"/>
-              <w:cnfStyle w:val="000000100000" w:firstRow="0" w:lastRow="0" w:firstColumn="0" w:lastColumn="0" w:oddVBand="0" w:evenVBand="0" w:oddHBand="1" w:evenHBand="0" w:firstRowFirstColumn="0" w:firstRowLastColumn="0" w:lastRowFirstColumn="0" w:lastRowLastColumn="0"/>
-              <w:rPr>
-                <w:rFonts w:ascii="Arial Narrow" w:hAnsi="Arial Narrow" w:cs="Calibri"/>
-                <w:b/>
-                <w:sz w:val="16"/>
-              </w:rPr>
-            </w:pPr>
-            <w:r>
-              <w:rPr>
-                <w:b/>
-                <w:sz w:val="14"/>
-              </w:rPr>
-            </w:r>
-            <w:proofErr w:type="spellStart"/>
-            <w:r>
-              <w:rPr>
-                <w:b/>
-                <w:sz w:val="14"/>
-              </w:rPr>
-            </w:r>
-            <w:proofErr w:type="spellEnd"/>
-            <w:r>
-              <w:rPr>
-                <w:b/>
-                <w:sz w:val="14"/>
-              </w:rPr>
-            </w:r>
-          </w:p>
-        </w:tc>
-      </w:tr>
     </w:tbl>
     <w:p>
       <w:pPr>
@@ -12804,1018 +11451,6 @@
           </w:p>
         </w:tc>
       </w:tr>
-      <w:tr>
-        <w:trPr>
-          <w:cnfStyle w:val="000000100000" w:firstRow="0" w:lastRow="0" w:firstColumn="0" w:lastColumn="0" w:oddVBand="0" w:evenVBand="0" w:oddHBand="1" w:evenHBand="0" w:firstRowFirstColumn="0" w:firstRowLastColumn="0" w:lastRowFirstColumn="0" w:lastRowLastColumn="0"/>
-          <w:trHeight w:hRule="exact" w:val="624"/>
-        </w:trPr>
-        <w:tc>
-          <w:tcPr>
-            <w:cnfStyle w:val="001000000000" w:firstRow="0" w:lastRow="0" w:firstColumn="1" w:lastColumn="0" w:oddVBand="0" w:evenVBand="0" w:oddHBand="0" w:evenHBand="0" w:firstRowFirstColumn="0" w:firstRowLastColumn="0" w:lastRowFirstColumn="0" w:lastRowLastColumn="0"/>
-            <w:tcW w:w="1276" w:type="dxa"/>
-            <w:tcBorders>
-              <w:top w:val="double" w:sz="4" w:space="0" w:color="auto"/>
-              <w:bottom w:val="double" w:sz="4" w:space="0" w:color="auto"/>
-            </w:tcBorders>
-            <w:vAlign w:val="center"/>
-          </w:tcPr>
-          <w:p>
-            <w:pPr>
-              <w:spacing w:after="160" w:line="259" w:lineRule="auto"/>
-              <w:jc w:val="center"/>
-              <w:rPr>
-                <w:sz w:val="16"/>
-              </w:rPr>
-            </w:pPr>
-            <w:r>
-              <w:rPr>
-                <w:caps w:val="0"/>
-                <w:sz w:val="16"/>
-              </w:rPr>
-            </w:r>
-            <w:r>
-              <w:rPr>
-                <w:rFonts w:ascii="Malgun Gothic" w:hAnsi="Malgun Gothic"/>
-                <w:b w:val="0"/>
-                <w:sz w:val="18"/>
-              </w:rPr>
-              <w:t>Tier 3</w:t>
-            </w:r>
-          </w:p>
-        </w:tc>
-        <w:tc>
-          <w:tcPr>
-            <w:tcW w:w="1134" w:type="dxa"/>
-            <w:tcBorders>
-              <w:top w:val="double" w:sz="4" w:space="0" w:color="auto"/>
-              <w:bottom w:val="double" w:sz="4" w:space="0" w:color="auto"/>
-            </w:tcBorders>
-            <w:vAlign w:val="center"/>
-          </w:tcPr>
-          <w:p>
-            <w:pPr>
-              <w:jc w:val="center"/>
-              <w:cnfStyle w:val="000000100000" w:firstRow="0" w:lastRow="0" w:firstColumn="0" w:lastColumn="0" w:oddVBand="0" w:evenVBand="0" w:oddHBand="1" w:evenHBand="0" w:firstRowFirstColumn="0" w:firstRowLastColumn="0" w:lastRowFirstColumn="0" w:lastRowLastColumn="0"/>
-              <w:rPr>
-                <w:rFonts w:ascii="Arial Narrow" w:hAnsi="Arial Narrow" w:cs="Calibri"/>
-                <w:b/>
-                <w:sz w:val="16"/>
-              </w:rPr>
-            </w:pPr>
-            <w:r>
-              <w:rPr>
-                <w:b/>
-                <w:sz w:val="16"/>
-              </w:rPr>
-            </w:r>
-            <w:r>
-              <w:rPr>
-                <w:rFonts w:ascii="Malgun Gothic" w:hAnsi="Malgun Gothic"/>
-                <w:b w:val="0"/>
-                <w:sz w:val="18"/>
-              </w:rPr>
-              <w:t>BRAF</w:t>
-            </w:r>
-          </w:p>
-        </w:tc>
-        <w:tc>
-          <w:tcPr>
-            <w:tcW w:w="1134" w:type="dxa"/>
-            <w:tcBorders>
-              <w:top w:val="double" w:sz="4" w:space="0" w:color="auto"/>
-              <w:bottom w:val="double" w:sz="4" w:space="0" w:color="auto"/>
-            </w:tcBorders>
-            <w:vAlign w:val="center"/>
-          </w:tcPr>
-          <w:p>
-            <w:pPr>
-              <w:jc w:val="center"/>
-              <w:cnfStyle w:val="000000100000" w:firstRow="0" w:lastRow="0" w:firstColumn="0" w:lastColumn="0" w:oddVBand="0" w:evenVBand="0" w:oddHBand="1" w:evenHBand="0" w:firstRowFirstColumn="0" w:firstRowLastColumn="0" w:lastRowFirstColumn="0" w:lastRowLastColumn="0"/>
-              <w:rPr>
-                <w:b/>
-                <w:sz w:val="16"/>
-              </w:rPr>
-            </w:pPr>
-            <w:r>
-              <w:rPr>
-                <w:b/>
-                <w:sz w:val="16"/>
-              </w:rPr>
-            </w:r>
-            <w:r>
-              <w:rPr>
-                <w:rFonts w:ascii="Malgun Gothic" w:hAnsi="Malgun Gothic"/>
-                <w:b w:val="0"/>
-                <w:sz w:val="18"/>
-              </w:rPr>
-              <w:t>ENST00000288602.6</w:t>
-            </w:r>
-          </w:p>
-          <w:p>
-            <w:pPr>
-              <w:jc w:val="center"/>
-              <w:cnfStyle w:val="000000100000" w:firstRow="0" w:lastRow="0" w:firstColumn="0" w:lastColumn="0" w:oddVBand="0" w:evenVBand="0" w:oddHBand="1" w:evenHBand="0" w:firstRowFirstColumn="0" w:firstRowLastColumn="0" w:lastRowFirstColumn="0" w:lastRowLastColumn="0"/>
-              <w:rPr>
-                <w:rFonts w:ascii="Arial Narrow" w:hAnsi="Arial Narrow" w:cs="Calibri"/>
-                <w:b/>
-                <w:sz w:val="16"/>
-              </w:rPr>
-            </w:pPr>
-            <w:r>
-              <w:rPr>
-                <w:b/>
-                <w:sz w:val="16"/>
-              </w:rPr>
-            </w:r>
-          </w:p>
-        </w:tc>
-        <w:tc>
-          <w:tcPr>
-            <w:tcW w:w="1418" w:type="dxa"/>
-            <w:tcBorders>
-              <w:top w:val="double" w:sz="4" w:space="0" w:color="auto"/>
-              <w:bottom w:val="double" w:sz="4" w:space="0" w:color="auto"/>
-            </w:tcBorders>
-            <w:vAlign w:val="center"/>
-          </w:tcPr>
-          <w:p>
-            <w:pPr>
-              <w:jc w:val="center"/>
-              <w:cnfStyle w:val="000000100000" w:firstRow="0" w:lastRow="0" w:firstColumn="0" w:lastColumn="0" w:oddVBand="0" w:evenVBand="0" w:oddHBand="1" w:evenHBand="0" w:firstRowFirstColumn="0" w:firstRowLastColumn="0" w:lastRowFirstColumn="0" w:lastRowLastColumn="0"/>
-              <w:rPr>
-                <w:rFonts w:ascii="Arial Narrow" w:hAnsi="Arial Narrow" w:cs="Calibri"/>
-                <w:b/>
-                <w:sz w:val="16"/>
-              </w:rPr>
-            </w:pPr>
-            <w:r>
-              <w:rPr>
-                <w:b/>
-                <w:sz w:val="16"/>
-              </w:rPr>
-            </w:r>
-            <w:r>
-              <w:rPr>
-                <w:rFonts w:ascii="Malgun Gothic" w:hAnsi="Malgun Gothic"/>
-                <w:b w:val="0"/>
-                <w:sz w:val="18"/>
-              </w:rPr>
-            </w:r>
-          </w:p>
-        </w:tc>
-        <w:tc>
-          <w:tcPr>
-            <w:tcW w:w="1275" w:type="dxa"/>
-            <w:tcBorders>
-              <w:top w:val="double" w:sz="4" w:space="0" w:color="auto"/>
-              <w:bottom w:val="double" w:sz="4" w:space="0" w:color="auto"/>
-            </w:tcBorders>
-            <w:vAlign w:val="center"/>
-          </w:tcPr>
-          <w:p>
-            <w:pPr>
-              <w:spacing w:after="160" w:line="259" w:lineRule="auto"/>
-              <w:jc w:val="center"/>
-              <w:cnfStyle w:val="000000100000" w:firstRow="0" w:lastRow="0" w:firstColumn="0" w:lastColumn="0" w:oddVBand="0" w:evenVBand="0" w:oddHBand="1" w:evenHBand="0" w:firstRowFirstColumn="0" w:firstRowLastColumn="0" w:lastRowFirstColumn="0" w:lastRowLastColumn="0"/>
-              <w:rPr>
-                <w:b/>
-                <w:sz w:val="16"/>
-              </w:rPr>
-            </w:pPr>
-            <w:r>
-              <w:rPr>
-                <w:b/>
-                <w:sz w:val="16"/>
-              </w:rPr>
-            </w:r>
-            <w:r>
-              <w:rPr>
-                <w:rFonts w:ascii="Malgun Gothic" w:hAnsi="Malgun Gothic"/>
-                <w:b w:val="0"/>
-                <w:sz w:val="18"/>
-              </w:rPr>
-              <w:t>c.2128-18_2128-16delinsCTT</w:t>
-            </w:r>
-          </w:p>
-        </w:tc>
-        <w:tc>
-          <w:tcPr>
-            <w:tcW w:w="1276" w:type="dxa"/>
-            <w:tcBorders>
-              <w:top w:val="double" w:sz="4" w:space="0" w:color="auto"/>
-              <w:bottom w:val="double" w:sz="4" w:space="0" w:color="auto"/>
-            </w:tcBorders>
-            <w:vAlign w:val="center"/>
-          </w:tcPr>
-          <w:p>
-            <w:pPr>
-              <w:jc w:val="center"/>
-              <w:cnfStyle w:val="000000100000" w:firstRow="0" w:lastRow="0" w:firstColumn="0" w:lastColumn="0" w:oddVBand="0" w:evenVBand="0" w:oddHBand="1" w:evenHBand="0" w:firstRowFirstColumn="0" w:firstRowLastColumn="0" w:lastRowFirstColumn="0" w:lastRowLastColumn="0"/>
-              <w:rPr>
-                <w:rFonts w:ascii="Arial Narrow" w:hAnsi="Arial Narrow" w:cs="Calibri"/>
-                <w:b/>
-                <w:sz w:val="16"/>
-              </w:rPr>
-            </w:pPr>
-            <w:r>
-              <w:rPr>
-                <w:b/>
-                <w:sz w:val="16"/>
-              </w:rPr>
-            </w:r>
-            <w:r>
-              <w:rPr>
-                <w:rFonts w:ascii="Malgun Gothic" w:hAnsi="Malgun Gothic"/>
-                <w:b w:val="0"/>
-                <w:sz w:val="18"/>
-              </w:rPr>
-            </w:r>
-          </w:p>
-        </w:tc>
-        <w:tc>
-          <w:tcPr>
-            <w:tcW w:w="709" w:type="dxa"/>
-            <w:tcBorders>
-              <w:top w:val="double" w:sz="4" w:space="0" w:color="auto"/>
-              <w:bottom w:val="double" w:sz="4" w:space="0" w:color="auto"/>
-            </w:tcBorders>
-            <w:vAlign w:val="center"/>
-          </w:tcPr>
-          <w:p>
-            <w:pPr>
-              <w:jc w:val="center"/>
-              <w:cnfStyle w:val="000000100000" w:firstRow="0" w:lastRow="0" w:firstColumn="0" w:lastColumn="0" w:oddVBand="0" w:evenVBand="0" w:oddHBand="1" w:evenHBand="0" w:firstRowFirstColumn="0" w:firstRowLastColumn="0" w:lastRowFirstColumn="0" w:lastRowLastColumn="0"/>
-              <w:rPr>
-                <w:rFonts w:ascii="Arial Narrow" w:hAnsi="Arial Narrow" w:cs="Calibri"/>
-                <w:b/>
-                <w:sz w:val="16"/>
-              </w:rPr>
-            </w:pPr>
-            <w:r>
-              <w:rPr>
-                <w:b/>
-                <w:sz w:val="16"/>
-              </w:rPr>
-            </w:r>
-            <w:r>
-              <w:rPr>
-                <w:rFonts w:ascii="Malgun Gothic" w:hAnsi="Malgun Gothic"/>
-                <w:b w:val="0"/>
-                <w:sz w:val="18"/>
-              </w:rPr>
-              <w:t>0.77%</w:t>
-            </w:r>
-          </w:p>
-        </w:tc>
-        <w:tc>
-          <w:tcPr>
-            <w:tcW w:w="2214" w:type="dxa"/>
-            <w:tcBorders>
-              <w:top w:val="double" w:sz="4" w:space="0" w:color="auto"/>
-              <w:bottom w:val="double" w:sz="4" w:space="0" w:color="auto"/>
-            </w:tcBorders>
-            <w:vAlign w:val="center"/>
-          </w:tcPr>
-          <w:p>
-            <w:pPr>
-              <w:jc w:val="center"/>
-              <w:cnfStyle w:val="000000100000" w:firstRow="0" w:lastRow="0" w:firstColumn="0" w:lastColumn="0" w:oddVBand="0" w:evenVBand="0" w:oddHBand="1" w:evenHBand="0" w:firstRowFirstColumn="0" w:firstRowLastColumn="0" w:lastRowFirstColumn="0" w:lastRowLastColumn="0"/>
-              <w:rPr>
-                <w:b/>
-                <w:sz w:val="16"/>
-              </w:rPr>
-            </w:pPr>
-            <w:r>
-              <w:rPr>
-                <w:b/>
-                <w:sz w:val="16"/>
-              </w:rPr>
-            </w:r>
-            <w:proofErr w:type="spellStart"/>
-            <w:r>
-              <w:rPr>
-                <w:b/>
-                <w:sz w:val="16"/>
-              </w:rPr>
-            </w:r>
-            <w:proofErr w:type="spellEnd"/>
-            <w:r>
-              <w:rPr>
-                <w:rFonts w:ascii="Malgun Gothic" w:hAnsi="Malgun Gothic"/>
-                <w:b w:val="0"/>
-                <w:sz w:val="18"/>
-              </w:rPr>
-            </w:r>
-          </w:p>
-          <w:p>
-            <w:pPr>
-              <w:jc w:val="center"/>
-              <w:cnfStyle w:val="000000100000" w:firstRow="0" w:lastRow="0" w:firstColumn="0" w:lastColumn="0" w:oddVBand="0" w:evenVBand="0" w:oddHBand="1" w:evenHBand="0" w:firstRowFirstColumn="0" w:firstRowLastColumn="0" w:lastRowFirstColumn="0" w:lastRowLastColumn="0"/>
-              <w:rPr>
-                <w:rFonts w:ascii="Arial Narrow" w:hAnsi="Arial Narrow" w:cs="Calibri"/>
-                <w:b/>
-                <w:sz w:val="16"/>
-              </w:rPr>
-            </w:pPr>
-            <w:r>
-              <w:rPr>
-                <w:b/>
-                <w:sz w:val="14"/>
-              </w:rPr>
-            </w:r>
-            <w:proofErr w:type="spellStart"/>
-            <w:r>
-              <w:rPr>
-                <w:b/>
-                <w:sz w:val="14"/>
-              </w:rPr>
-            </w:r>
-            <w:proofErr w:type="spellEnd"/>
-            <w:r>
-              <w:rPr>
-                <w:b/>
-                <w:sz w:val="14"/>
-              </w:rPr>
-            </w:r>
-          </w:p>
-        </w:tc>
-      </w:tr>
-      <w:tr>
-        <w:trPr>
-          <w:cnfStyle w:val="000000100000" w:firstRow="0" w:lastRow="0" w:firstColumn="0" w:lastColumn="0" w:oddVBand="0" w:evenVBand="0" w:oddHBand="1" w:evenHBand="0" w:firstRowFirstColumn="0" w:firstRowLastColumn="0" w:lastRowFirstColumn="0" w:lastRowLastColumn="0"/>
-          <w:trHeight w:hRule="exact" w:val="624"/>
-        </w:trPr>
-        <w:tc>
-          <w:tcPr>
-            <w:cnfStyle w:val="001000000000" w:firstRow="0" w:lastRow="0" w:firstColumn="1" w:lastColumn="0" w:oddVBand="0" w:evenVBand="0" w:oddHBand="0" w:evenHBand="0" w:firstRowFirstColumn="0" w:firstRowLastColumn="0" w:lastRowFirstColumn="0" w:lastRowLastColumn="0"/>
-            <w:tcW w:w="1276" w:type="dxa"/>
-            <w:tcBorders>
-              <w:top w:val="double" w:sz="4" w:space="0" w:color="auto"/>
-              <w:bottom w:val="double" w:sz="4" w:space="0" w:color="auto"/>
-            </w:tcBorders>
-            <w:vAlign w:val="center"/>
-          </w:tcPr>
-          <w:p>
-            <w:pPr>
-              <w:spacing w:after="160" w:line="259" w:lineRule="auto"/>
-              <w:jc w:val="center"/>
-              <w:rPr>
-                <w:sz w:val="16"/>
-              </w:rPr>
-            </w:pPr>
-            <w:r>
-              <w:rPr>
-                <w:caps w:val="0"/>
-                <w:sz w:val="16"/>
-              </w:rPr>
-            </w:r>
-            <w:r>
-              <w:rPr>
-                <w:rFonts w:ascii="Malgun Gothic" w:hAnsi="Malgun Gothic"/>
-                <w:b w:val="0"/>
-                <w:sz w:val="18"/>
-              </w:rPr>
-              <w:t>Tier 3</w:t>
-            </w:r>
-          </w:p>
-        </w:tc>
-        <w:tc>
-          <w:tcPr>
-            <w:tcW w:w="1134" w:type="dxa"/>
-            <w:tcBorders>
-              <w:top w:val="double" w:sz="4" w:space="0" w:color="auto"/>
-              <w:bottom w:val="double" w:sz="4" w:space="0" w:color="auto"/>
-            </w:tcBorders>
-            <w:vAlign w:val="center"/>
-          </w:tcPr>
-          <w:p>
-            <w:pPr>
-              <w:jc w:val="center"/>
-              <w:cnfStyle w:val="000000100000" w:firstRow="0" w:lastRow="0" w:firstColumn="0" w:lastColumn="0" w:oddVBand="0" w:evenVBand="0" w:oddHBand="1" w:evenHBand="0" w:firstRowFirstColumn="0" w:firstRowLastColumn="0" w:lastRowFirstColumn="0" w:lastRowLastColumn="0"/>
-              <w:rPr>
-                <w:rFonts w:ascii="Arial Narrow" w:hAnsi="Arial Narrow" w:cs="Calibri"/>
-                <w:b/>
-                <w:sz w:val="16"/>
-              </w:rPr>
-            </w:pPr>
-            <w:r>
-              <w:rPr>
-                <w:b/>
-                <w:sz w:val="16"/>
-              </w:rPr>
-            </w:r>
-            <w:r>
-              <w:rPr>
-                <w:rFonts w:ascii="Malgun Gothic" w:hAnsi="Malgun Gothic"/>
-                <w:b w:val="0"/>
-                <w:sz w:val="18"/>
-              </w:rPr>
-              <w:t>ITPKB</w:t>
-            </w:r>
-          </w:p>
-        </w:tc>
-        <w:tc>
-          <w:tcPr>
-            <w:tcW w:w="1134" w:type="dxa"/>
-            <w:tcBorders>
-              <w:top w:val="double" w:sz="4" w:space="0" w:color="auto"/>
-              <w:bottom w:val="double" w:sz="4" w:space="0" w:color="auto"/>
-            </w:tcBorders>
-            <w:vAlign w:val="center"/>
-          </w:tcPr>
-          <w:p>
-            <w:pPr>
-              <w:jc w:val="center"/>
-              <w:cnfStyle w:val="000000100000" w:firstRow="0" w:lastRow="0" w:firstColumn="0" w:lastColumn="0" w:oddVBand="0" w:evenVBand="0" w:oddHBand="1" w:evenHBand="0" w:firstRowFirstColumn="0" w:firstRowLastColumn="0" w:lastRowFirstColumn="0" w:lastRowLastColumn="0"/>
-              <w:rPr>
-                <w:b/>
-                <w:sz w:val="16"/>
-              </w:rPr>
-            </w:pPr>
-            <w:r>
-              <w:rPr>
-                <w:b/>
-                <w:sz w:val="16"/>
-              </w:rPr>
-            </w:r>
-            <w:r>
-              <w:rPr>
-                <w:rFonts w:ascii="Malgun Gothic" w:hAnsi="Malgun Gothic"/>
-                <w:b w:val="0"/>
-                <w:sz w:val="18"/>
-              </w:rPr>
-              <w:t>ENST00000429204.1</w:t>
-            </w:r>
-          </w:p>
-          <w:p>
-            <w:pPr>
-              <w:jc w:val="center"/>
-              <w:cnfStyle w:val="000000100000" w:firstRow="0" w:lastRow="0" w:firstColumn="0" w:lastColumn="0" w:oddVBand="0" w:evenVBand="0" w:oddHBand="1" w:evenHBand="0" w:firstRowFirstColumn="0" w:firstRowLastColumn="0" w:lastRowFirstColumn="0" w:lastRowLastColumn="0"/>
-              <w:rPr>
-                <w:rFonts w:ascii="Arial Narrow" w:hAnsi="Arial Narrow" w:cs="Calibri"/>
-                <w:b/>
-                <w:sz w:val="16"/>
-              </w:rPr>
-            </w:pPr>
-            <w:r>
-              <w:rPr>
-                <w:b/>
-                <w:sz w:val="16"/>
-              </w:rPr>
-            </w:r>
-          </w:p>
-        </w:tc>
-        <w:tc>
-          <w:tcPr>
-            <w:tcW w:w="1418" w:type="dxa"/>
-            <w:tcBorders>
-              <w:top w:val="double" w:sz="4" w:space="0" w:color="auto"/>
-              <w:bottom w:val="double" w:sz="4" w:space="0" w:color="auto"/>
-            </w:tcBorders>
-            <w:vAlign w:val="center"/>
-          </w:tcPr>
-          <w:p>
-            <w:pPr>
-              <w:jc w:val="center"/>
-              <w:cnfStyle w:val="000000100000" w:firstRow="0" w:lastRow="0" w:firstColumn="0" w:lastColumn="0" w:oddVBand="0" w:evenVBand="0" w:oddHBand="1" w:evenHBand="0" w:firstRowFirstColumn="0" w:firstRowLastColumn="0" w:lastRowFirstColumn="0" w:lastRowLastColumn="0"/>
-              <w:rPr>
-                <w:rFonts w:ascii="Arial Narrow" w:hAnsi="Arial Narrow" w:cs="Calibri"/>
-                <w:b/>
-                <w:sz w:val="16"/>
-              </w:rPr>
-            </w:pPr>
-            <w:r>
-              <w:rPr>
-                <w:b/>
-                <w:sz w:val="16"/>
-              </w:rPr>
-            </w:r>
-            <w:r>
-              <w:rPr>
-                <w:rFonts w:ascii="Malgun Gothic" w:hAnsi="Malgun Gothic"/>
-                <w:b w:val="0"/>
-                <w:sz w:val="18"/>
-              </w:rPr>
-              <w:t>ENSP00000411152.1</w:t>
-            </w:r>
-          </w:p>
-        </w:tc>
-        <w:tc>
-          <w:tcPr>
-            <w:tcW w:w="1275" w:type="dxa"/>
-            <w:tcBorders>
-              <w:top w:val="double" w:sz="4" w:space="0" w:color="auto"/>
-              <w:bottom w:val="double" w:sz="4" w:space="0" w:color="auto"/>
-            </w:tcBorders>
-            <w:vAlign w:val="center"/>
-          </w:tcPr>
-          <w:p>
-            <w:pPr>
-              <w:spacing w:after="160" w:line="259" w:lineRule="auto"/>
-              <w:jc w:val="center"/>
-              <w:cnfStyle w:val="000000100000" w:firstRow="0" w:lastRow="0" w:firstColumn="0" w:lastColumn="0" w:oddVBand="0" w:evenVBand="0" w:oddHBand="1" w:evenHBand="0" w:firstRowFirstColumn="0" w:firstRowLastColumn="0" w:lastRowFirstColumn="0" w:lastRowLastColumn="0"/>
-              <w:rPr>
-                <w:b/>
-                <w:sz w:val="16"/>
-              </w:rPr>
-            </w:pPr>
-            <w:r>
-              <w:rPr>
-                <w:b/>
-                <w:sz w:val="16"/>
-              </w:rPr>
-            </w:r>
-            <w:r>
-              <w:rPr>
-                <w:rFonts w:ascii="Malgun Gothic" w:hAnsi="Malgun Gothic"/>
-                <w:b w:val="0"/>
-                <w:sz w:val="18"/>
-              </w:rPr>
-              <w:t>c.275_276insTGG</w:t>
-            </w:r>
-          </w:p>
-        </w:tc>
-        <w:tc>
-          <w:tcPr>
-            <w:tcW w:w="1276" w:type="dxa"/>
-            <w:tcBorders>
-              <w:top w:val="double" w:sz="4" w:space="0" w:color="auto"/>
-              <w:bottom w:val="double" w:sz="4" w:space="0" w:color="auto"/>
-            </w:tcBorders>
-            <w:vAlign w:val="center"/>
-          </w:tcPr>
-          <w:p>
-            <w:pPr>
-              <w:jc w:val="center"/>
-              <w:cnfStyle w:val="000000100000" w:firstRow="0" w:lastRow="0" w:firstColumn="0" w:lastColumn="0" w:oddVBand="0" w:evenVBand="0" w:oddHBand="1" w:evenHBand="0" w:firstRowFirstColumn="0" w:firstRowLastColumn="0" w:lastRowFirstColumn="0" w:lastRowLastColumn="0"/>
-              <w:rPr>
-                <w:rFonts w:ascii="Arial Narrow" w:hAnsi="Arial Narrow" w:cs="Calibri"/>
-                <w:b/>
-                <w:sz w:val="16"/>
-              </w:rPr>
-            </w:pPr>
-            <w:r>
-              <w:rPr>
-                <w:b/>
-                <w:sz w:val="16"/>
-              </w:rPr>
-            </w:r>
-            <w:r>
-              <w:rPr>
-                <w:rFonts w:ascii="Malgun Gothic" w:hAnsi="Malgun Gothic"/>
-                <w:b w:val="0"/>
-                <w:sz w:val="18"/>
-              </w:rPr>
-              <w:t>p.Ser92_Ser93insGly</w:t>
-            </w:r>
-          </w:p>
-        </w:tc>
-        <w:tc>
-          <w:tcPr>
-            <w:tcW w:w="709" w:type="dxa"/>
-            <w:tcBorders>
-              <w:top w:val="double" w:sz="4" w:space="0" w:color="auto"/>
-              <w:bottom w:val="double" w:sz="4" w:space="0" w:color="auto"/>
-            </w:tcBorders>
-            <w:vAlign w:val="center"/>
-          </w:tcPr>
-          <w:p>
-            <w:pPr>
-              <w:jc w:val="center"/>
-              <w:cnfStyle w:val="000000100000" w:firstRow="0" w:lastRow="0" w:firstColumn="0" w:lastColumn="0" w:oddVBand="0" w:evenVBand="0" w:oddHBand="1" w:evenHBand="0" w:firstRowFirstColumn="0" w:firstRowLastColumn="0" w:lastRowFirstColumn="0" w:lastRowLastColumn="0"/>
-              <w:rPr>
-                <w:rFonts w:ascii="Arial Narrow" w:hAnsi="Arial Narrow" w:cs="Calibri"/>
-                <w:b/>
-                <w:sz w:val="16"/>
-              </w:rPr>
-            </w:pPr>
-            <w:r>
-              <w:rPr>
-                <w:b/>
-                <w:sz w:val="16"/>
-              </w:rPr>
-            </w:r>
-            <w:r>
-              <w:rPr>
-                <w:rFonts w:ascii="Malgun Gothic" w:hAnsi="Malgun Gothic"/>
-                <w:b w:val="0"/>
-                <w:sz w:val="18"/>
-              </w:rPr>
-              <w:t>0.58%</w:t>
-            </w:r>
-          </w:p>
-        </w:tc>
-        <w:tc>
-          <w:tcPr>
-            <w:tcW w:w="2214" w:type="dxa"/>
-            <w:tcBorders>
-              <w:top w:val="double" w:sz="4" w:space="0" w:color="auto"/>
-              <w:bottom w:val="double" w:sz="4" w:space="0" w:color="auto"/>
-            </w:tcBorders>
-            <w:vAlign w:val="center"/>
-          </w:tcPr>
-          <w:p>
-            <w:pPr>
-              <w:jc w:val="center"/>
-              <w:cnfStyle w:val="000000100000" w:firstRow="0" w:lastRow="0" w:firstColumn="0" w:lastColumn="0" w:oddVBand="0" w:evenVBand="0" w:oddHBand="1" w:evenHBand="0" w:firstRowFirstColumn="0" w:firstRowLastColumn="0" w:lastRowFirstColumn="0" w:lastRowLastColumn="0"/>
-              <w:rPr>
-                <w:b/>
-                <w:sz w:val="16"/>
-              </w:rPr>
-            </w:pPr>
-            <w:r>
-              <w:rPr>
-                <w:b/>
-                <w:sz w:val="16"/>
-              </w:rPr>
-            </w:r>
-            <w:proofErr w:type="spellStart"/>
-            <w:r>
-              <w:rPr>
-                <w:b/>
-                <w:sz w:val="16"/>
-              </w:rPr>
-            </w:r>
-            <w:proofErr w:type="spellEnd"/>
-            <w:r>
-              <w:rPr>
-                <w:rFonts w:ascii="Malgun Gothic" w:hAnsi="Malgun Gothic"/>
-                <w:b w:val="0"/>
-                <w:sz w:val="18"/>
-              </w:rPr>
-            </w:r>
-          </w:p>
-          <w:p>
-            <w:pPr>
-              <w:jc w:val="center"/>
-              <w:cnfStyle w:val="000000100000" w:firstRow="0" w:lastRow="0" w:firstColumn="0" w:lastColumn="0" w:oddVBand="0" w:evenVBand="0" w:oddHBand="1" w:evenHBand="0" w:firstRowFirstColumn="0" w:firstRowLastColumn="0" w:lastRowFirstColumn="0" w:lastRowLastColumn="0"/>
-              <w:rPr>
-                <w:rFonts w:ascii="Arial Narrow" w:hAnsi="Arial Narrow" w:cs="Calibri"/>
-                <w:b/>
-                <w:sz w:val="16"/>
-              </w:rPr>
-            </w:pPr>
-            <w:r>
-              <w:rPr>
-                <w:b/>
-                <w:sz w:val="14"/>
-              </w:rPr>
-            </w:r>
-            <w:proofErr w:type="spellStart"/>
-            <w:r>
-              <w:rPr>
-                <w:b/>
-                <w:sz w:val="14"/>
-              </w:rPr>
-            </w:r>
-            <w:proofErr w:type="spellEnd"/>
-            <w:r>
-              <w:rPr>
-                <w:b/>
-                <w:sz w:val="14"/>
-              </w:rPr>
-            </w:r>
-          </w:p>
-        </w:tc>
-      </w:tr>
-      <w:tr>
-        <w:trPr>
-          <w:cnfStyle w:val="000000100000" w:firstRow="0" w:lastRow="0" w:firstColumn="0" w:lastColumn="0" w:oddVBand="0" w:evenVBand="0" w:oddHBand="1" w:evenHBand="0" w:firstRowFirstColumn="0" w:firstRowLastColumn="0" w:lastRowFirstColumn="0" w:lastRowLastColumn="0"/>
-          <w:trHeight w:hRule="exact" w:val="624"/>
-        </w:trPr>
-        <w:tc>
-          <w:tcPr>
-            <w:cnfStyle w:val="001000000000" w:firstRow="0" w:lastRow="0" w:firstColumn="1" w:lastColumn="0" w:oddVBand="0" w:evenVBand="0" w:oddHBand="0" w:evenHBand="0" w:firstRowFirstColumn="0" w:firstRowLastColumn="0" w:lastRowFirstColumn="0" w:lastRowLastColumn="0"/>
-            <w:tcW w:w="1276" w:type="dxa"/>
-            <w:tcBorders>
-              <w:top w:val="double" w:sz="4" w:space="0" w:color="auto"/>
-              <w:bottom w:val="double" w:sz="4" w:space="0" w:color="auto"/>
-            </w:tcBorders>
-            <w:vAlign w:val="center"/>
-          </w:tcPr>
-          <w:p>
-            <w:pPr>
-              <w:spacing w:after="160" w:line="259" w:lineRule="auto"/>
-              <w:jc w:val="center"/>
-              <w:rPr>
-                <w:sz w:val="16"/>
-              </w:rPr>
-            </w:pPr>
-            <w:r>
-              <w:rPr>
-                <w:caps w:val="0"/>
-                <w:sz w:val="16"/>
-              </w:rPr>
-            </w:r>
-            <w:r>
-              <w:rPr>
-                <w:rFonts w:ascii="Malgun Gothic" w:hAnsi="Malgun Gothic"/>
-                <w:b w:val="0"/>
-                <w:sz w:val="18"/>
-              </w:rPr>
-              <w:t>Tier 3</w:t>
-            </w:r>
-          </w:p>
-        </w:tc>
-        <w:tc>
-          <w:tcPr>
-            <w:tcW w:w="1134" w:type="dxa"/>
-            <w:tcBorders>
-              <w:top w:val="double" w:sz="4" w:space="0" w:color="auto"/>
-              <w:bottom w:val="double" w:sz="4" w:space="0" w:color="auto"/>
-            </w:tcBorders>
-            <w:vAlign w:val="center"/>
-          </w:tcPr>
-          <w:p>
-            <w:pPr>
-              <w:jc w:val="center"/>
-              <w:cnfStyle w:val="000000100000" w:firstRow="0" w:lastRow="0" w:firstColumn="0" w:lastColumn="0" w:oddVBand="0" w:evenVBand="0" w:oddHBand="1" w:evenHBand="0" w:firstRowFirstColumn="0" w:firstRowLastColumn="0" w:lastRowFirstColumn="0" w:lastRowLastColumn="0"/>
-              <w:rPr>
-                <w:rFonts w:ascii="Arial Narrow" w:hAnsi="Arial Narrow" w:cs="Calibri"/>
-                <w:b/>
-                <w:sz w:val="16"/>
-              </w:rPr>
-            </w:pPr>
-            <w:r>
-              <w:rPr>
-                <w:b/>
-                <w:sz w:val="16"/>
-              </w:rPr>
-            </w:r>
-            <w:r>
-              <w:rPr>
-                <w:rFonts w:ascii="Malgun Gothic" w:hAnsi="Malgun Gothic"/>
-                <w:b w:val="0"/>
-                <w:sz w:val="18"/>
-              </w:rPr>
-              <w:t>KMT2C</w:t>
-            </w:r>
-          </w:p>
-        </w:tc>
-        <w:tc>
-          <w:tcPr>
-            <w:tcW w:w="1134" w:type="dxa"/>
-            <w:tcBorders>
-              <w:top w:val="double" w:sz="4" w:space="0" w:color="auto"/>
-              <w:bottom w:val="double" w:sz="4" w:space="0" w:color="auto"/>
-            </w:tcBorders>
-            <w:vAlign w:val="center"/>
-          </w:tcPr>
-          <w:p>
-            <w:pPr>
-              <w:jc w:val="center"/>
-              <w:cnfStyle w:val="000000100000" w:firstRow="0" w:lastRow="0" w:firstColumn="0" w:lastColumn="0" w:oddVBand="0" w:evenVBand="0" w:oddHBand="1" w:evenHBand="0" w:firstRowFirstColumn="0" w:firstRowLastColumn="0" w:lastRowFirstColumn="0" w:lastRowLastColumn="0"/>
-              <w:rPr>
-                <w:b/>
-                <w:sz w:val="16"/>
-              </w:rPr>
-            </w:pPr>
-            <w:r>
-              <w:rPr>
-                <w:b/>
-                <w:sz w:val="16"/>
-              </w:rPr>
-            </w:r>
-            <w:r>
-              <w:rPr>
-                <w:rFonts w:ascii="Malgun Gothic" w:hAnsi="Malgun Gothic"/>
-                <w:b w:val="0"/>
-                <w:sz w:val="18"/>
-              </w:rPr>
-              <w:t>ENST00000262189.6</w:t>
-            </w:r>
-          </w:p>
-          <w:p>
-            <w:pPr>
-              <w:jc w:val="center"/>
-              <w:cnfStyle w:val="000000100000" w:firstRow="0" w:lastRow="0" w:firstColumn="0" w:lastColumn="0" w:oddVBand="0" w:evenVBand="0" w:oddHBand="1" w:evenHBand="0" w:firstRowFirstColumn="0" w:firstRowLastColumn="0" w:lastRowFirstColumn="0" w:lastRowLastColumn="0"/>
-              <w:rPr>
-                <w:rFonts w:ascii="Arial Narrow" w:hAnsi="Arial Narrow" w:cs="Calibri"/>
-                <w:b/>
-                <w:sz w:val="16"/>
-              </w:rPr>
-            </w:pPr>
-            <w:r>
-              <w:rPr>
-                <w:b/>
-                <w:sz w:val="16"/>
-              </w:rPr>
-            </w:r>
-          </w:p>
-        </w:tc>
-        <w:tc>
-          <w:tcPr>
-            <w:tcW w:w="1418" w:type="dxa"/>
-            <w:tcBorders>
-              <w:top w:val="double" w:sz="4" w:space="0" w:color="auto"/>
-              <w:bottom w:val="double" w:sz="4" w:space="0" w:color="auto"/>
-            </w:tcBorders>
-            <w:vAlign w:val="center"/>
-          </w:tcPr>
-          <w:p>
-            <w:pPr>
-              <w:jc w:val="center"/>
-              <w:cnfStyle w:val="000000100000" w:firstRow="0" w:lastRow="0" w:firstColumn="0" w:lastColumn="0" w:oddVBand="0" w:evenVBand="0" w:oddHBand="1" w:evenHBand="0" w:firstRowFirstColumn="0" w:firstRowLastColumn="0" w:lastRowFirstColumn="0" w:lastRowLastColumn="0"/>
-              <w:rPr>
-                <w:rFonts w:ascii="Arial Narrow" w:hAnsi="Arial Narrow" w:cs="Calibri"/>
-                <w:b/>
-                <w:sz w:val="16"/>
-              </w:rPr>
-            </w:pPr>
-            <w:r>
-              <w:rPr>
-                <w:b/>
-                <w:sz w:val="16"/>
-              </w:rPr>
-            </w:r>
-            <w:r>
-              <w:rPr>
-                <w:rFonts w:ascii="Malgun Gothic" w:hAnsi="Malgun Gothic"/>
-                <w:b w:val="0"/>
-                <w:sz w:val="18"/>
-              </w:rPr>
-              <w:t>ENSP00000262189.6</w:t>
-            </w:r>
-          </w:p>
-        </w:tc>
-        <w:tc>
-          <w:tcPr>
-            <w:tcW w:w="1275" w:type="dxa"/>
-            <w:tcBorders>
-              <w:top w:val="double" w:sz="4" w:space="0" w:color="auto"/>
-              <w:bottom w:val="double" w:sz="4" w:space="0" w:color="auto"/>
-            </w:tcBorders>
-            <w:vAlign w:val="center"/>
-          </w:tcPr>
-          <w:p>
-            <w:pPr>
-              <w:spacing w:after="160" w:line="259" w:lineRule="auto"/>
-              <w:jc w:val="center"/>
-              <w:cnfStyle w:val="000000100000" w:firstRow="0" w:lastRow="0" w:firstColumn="0" w:lastColumn="0" w:oddVBand="0" w:evenVBand="0" w:oddHBand="1" w:evenHBand="0" w:firstRowFirstColumn="0" w:firstRowLastColumn="0" w:lastRowFirstColumn="0" w:lastRowLastColumn="0"/>
-              <w:rPr>
-                <w:b/>
-                <w:sz w:val="16"/>
-              </w:rPr>
-            </w:pPr>
-            <w:r>
-              <w:rPr>
-                <w:b/>
-                <w:sz w:val="16"/>
-              </w:rPr>
-            </w:r>
-            <w:r>
-              <w:rPr>
-                <w:rFonts w:ascii="Malgun Gothic" w:hAnsi="Malgun Gothic"/>
-                <w:b w:val="0"/>
-                <w:sz w:val="18"/>
-              </w:rPr>
-              <w:t>c.8596G&gt;A</w:t>
-            </w:r>
-          </w:p>
-        </w:tc>
-        <w:tc>
-          <w:tcPr>
-            <w:tcW w:w="1276" w:type="dxa"/>
-            <w:tcBorders>
-              <w:top w:val="double" w:sz="4" w:space="0" w:color="auto"/>
-              <w:bottom w:val="double" w:sz="4" w:space="0" w:color="auto"/>
-            </w:tcBorders>
-            <w:vAlign w:val="center"/>
-          </w:tcPr>
-          <w:p>
-            <w:pPr>
-              <w:jc w:val="center"/>
-              <w:cnfStyle w:val="000000100000" w:firstRow="0" w:lastRow="0" w:firstColumn="0" w:lastColumn="0" w:oddVBand="0" w:evenVBand="0" w:oddHBand="1" w:evenHBand="0" w:firstRowFirstColumn="0" w:firstRowLastColumn="0" w:lastRowFirstColumn="0" w:lastRowLastColumn="0"/>
-              <w:rPr>
-                <w:rFonts w:ascii="Arial Narrow" w:hAnsi="Arial Narrow" w:cs="Calibri"/>
-                <w:b/>
-                <w:sz w:val="16"/>
-              </w:rPr>
-            </w:pPr>
-            <w:r>
-              <w:rPr>
-                <w:b/>
-                <w:sz w:val="16"/>
-              </w:rPr>
-            </w:r>
-            <w:r>
-              <w:rPr>
-                <w:rFonts w:ascii="Malgun Gothic" w:hAnsi="Malgun Gothic"/>
-                <w:b w:val="0"/>
-                <w:sz w:val="18"/>
-              </w:rPr>
-              <w:t>p.Glu2866Lys</w:t>
-            </w:r>
-          </w:p>
-        </w:tc>
-        <w:tc>
-          <w:tcPr>
-            <w:tcW w:w="709" w:type="dxa"/>
-            <w:tcBorders>
-              <w:top w:val="double" w:sz="4" w:space="0" w:color="auto"/>
-              <w:bottom w:val="double" w:sz="4" w:space="0" w:color="auto"/>
-            </w:tcBorders>
-            <w:vAlign w:val="center"/>
-          </w:tcPr>
-          <w:p>
-            <w:pPr>
-              <w:jc w:val="center"/>
-              <w:cnfStyle w:val="000000100000" w:firstRow="0" w:lastRow="0" w:firstColumn="0" w:lastColumn="0" w:oddVBand="0" w:evenVBand="0" w:oddHBand="1" w:evenHBand="0" w:firstRowFirstColumn="0" w:firstRowLastColumn="0" w:lastRowFirstColumn="0" w:lastRowLastColumn="0"/>
-              <w:rPr>
-                <w:rFonts w:ascii="Arial Narrow" w:hAnsi="Arial Narrow" w:cs="Calibri"/>
-                <w:b/>
-                <w:sz w:val="16"/>
-              </w:rPr>
-            </w:pPr>
-            <w:r>
-              <w:rPr>
-                <w:b/>
-                <w:sz w:val="16"/>
-              </w:rPr>
-            </w:r>
-            <w:r>
-              <w:rPr>
-                <w:rFonts w:ascii="Malgun Gothic" w:hAnsi="Malgun Gothic"/>
-                <w:b w:val="0"/>
-                <w:sz w:val="18"/>
-              </w:rPr>
-              <w:t>0.13%</w:t>
-            </w:r>
-          </w:p>
-        </w:tc>
-        <w:tc>
-          <w:tcPr>
-            <w:tcW w:w="2214" w:type="dxa"/>
-            <w:tcBorders>
-              <w:top w:val="double" w:sz="4" w:space="0" w:color="auto"/>
-              <w:bottom w:val="double" w:sz="4" w:space="0" w:color="auto"/>
-            </w:tcBorders>
-            <w:vAlign w:val="center"/>
-          </w:tcPr>
-          <w:p>
-            <w:pPr>
-              <w:jc w:val="center"/>
-              <w:cnfStyle w:val="000000100000" w:firstRow="0" w:lastRow="0" w:firstColumn="0" w:lastColumn="0" w:oddVBand="0" w:evenVBand="0" w:oddHBand="1" w:evenHBand="0" w:firstRowFirstColumn="0" w:firstRowLastColumn="0" w:lastRowFirstColumn="0" w:lastRowLastColumn="0"/>
-              <w:rPr>
-                <w:b/>
-                <w:sz w:val="16"/>
-              </w:rPr>
-            </w:pPr>
-            <w:r>
-              <w:rPr>
-                <w:b/>
-                <w:sz w:val="16"/>
-              </w:rPr>
-            </w:r>
-            <w:proofErr w:type="spellStart"/>
-            <w:r>
-              <w:rPr>
-                <w:b/>
-                <w:sz w:val="16"/>
-              </w:rPr>
-            </w:r>
-            <w:proofErr w:type="spellEnd"/>
-            <w:r>
-              <w:rPr>
-                <w:rFonts w:ascii="Malgun Gothic" w:hAnsi="Malgun Gothic"/>
-                <w:b w:val="0"/>
-                <w:sz w:val="18"/>
-              </w:rPr>
-            </w:r>
-          </w:p>
-          <w:p>
-            <w:pPr>
-              <w:jc w:val="center"/>
-              <w:cnfStyle w:val="000000100000" w:firstRow="0" w:lastRow="0" w:firstColumn="0" w:lastColumn="0" w:oddVBand="0" w:evenVBand="0" w:oddHBand="1" w:evenHBand="0" w:firstRowFirstColumn="0" w:firstRowLastColumn="0" w:lastRowFirstColumn="0" w:lastRowLastColumn="0"/>
-              <w:rPr>
-                <w:rFonts w:ascii="Arial Narrow" w:hAnsi="Arial Narrow" w:cs="Calibri"/>
-                <w:b/>
-                <w:sz w:val="16"/>
-              </w:rPr>
-            </w:pPr>
-            <w:r>
-              <w:rPr>
-                <w:b/>
-                <w:sz w:val="14"/>
-              </w:rPr>
-            </w:r>
-            <w:proofErr w:type="spellStart"/>
-            <w:r>
-              <w:rPr>
-                <w:b/>
-                <w:sz w:val="14"/>
-              </w:rPr>
-            </w:r>
-            <w:proofErr w:type="spellEnd"/>
-            <w:r>
-              <w:rPr>
-                <w:b/>
-                <w:sz w:val="14"/>
-              </w:rPr>
-            </w:r>
-          </w:p>
-        </w:tc>
-      </w:tr>
     </w:tbl>
     <w:p/>
     <w:p>
@@ -14048,7 +11683,7 @@
               <w:t>* Tier I : 임상적 의미가 확인된 변이, ** Tier II : 잠재적 임상적 의미가 있는 변이, *** Tier III : 임상적 의미가 알려지지 않은 변이</w:t>
               <w:br/>
               <w:br/>
-              <w:t>Total variants analyzed: 436 | Tier 1: 0 | Tier 2: 13 | Tier 3: 23 | Tier 4: 400</w:t>
+              <w:t>Total variants analyzed: 29 | Tier 1: 0 | Tier 2: 9 | Tier 3: 20 | Tier 4: 0</w:t>
             </w:r>
           </w:p>
           <w:p>

</xml_diff>